<commit_message>
Phase 4: run the 4 missing candidates (CatBoost/HGB/SVM/ExtraTrees)
Trained + scored locally in ~1-5 min each — the earlier session had offloaded
them to free Colab (2 weak vCPUs) where they stalled past 20 min. Full field
now, real-eval macro-F1:

  LightGBM 0.866 | MLP 0.847 | HGB 0.811 | RF 0.788 | CatBoost 0.786
  SVM 0.775 | ExtraTrees 0.757 | LogReg 0.610

The GBDT family does NOT cluster around LightGBM as assumed: CatBoost -8, HGB
-5.5 real-eval points at the screening configs. HGB has the best calibration of
any candidate (ECE 0.022) but trails MLP on accuracy + confidence spread.
CatBoost is tiny (2.7 MB) but not accurate enough. None of the four changes the
LightGBM-vs-MLP decision — but it is now measured, not assumed.

Lock unchanged: MLP / both / seed 0 (mlp.joblib byte-identical, not retrained).
model_comparison.json + scatter + report + baseline doc + plan + memory updated.
</commit_message>
<xml_diff>
--- a/results/phase4/classifier_report.docx
+++ b/results/phase4/classifier_report.docx
@@ -25,7 +25,7 @@
           <w:color w:val="1A7F37"/>
           <w:sz w:val="24"/>
         </w:rPr>
-        <w:t>4 candidate classifiers trained on the same 12-class pipeline (train 52,738 / val 2,357 / test 1,254), scored by classifier/evaluate.py. LOCKED pick: MLP (features 'both', seed 0). LGBM is nominally top on raw real-eval (0.866) but MLP ties it within seed noise and wins on confidence separation + size (section 5).</w:t>
+        <w:t>8 candidate classifiers trained on the same 12-class pipeline (train 52,738 / val 2,357 / test 1,254), scored by classifier/evaluate.py. LOCKED pick: MLP (features 'both', seed 0). LGBM is nominally top on raw real-eval (0.866) but MLP ties it within seed noise and wins on confidence separation + size (section 5).</w:t>
       </w:r>
     </w:p>
     <w:p>
@@ -48,16 +48,20 @@
         <w:tblLook w:firstColumn="1" w:firstRow="1" w:lastColumn="0" w:lastRow="0" w:noHBand="0" w:noVBand="1" w:val="04A0"/>
       </w:tblPr>
       <w:tblGrid>
-        <w:gridCol w:w="1728"/>
-        <w:gridCol w:w="1728"/>
-        <w:gridCol w:w="1728"/>
-        <w:gridCol w:w="1728"/>
-        <w:gridCol w:w="1728"/>
+        <w:gridCol w:w="960"/>
+        <w:gridCol w:w="960"/>
+        <w:gridCol w:w="960"/>
+        <w:gridCol w:w="960"/>
+        <w:gridCol w:w="960"/>
+        <w:gridCol w:w="960"/>
+        <w:gridCol w:w="960"/>
+        <w:gridCol w:w="960"/>
+        <w:gridCol w:w="960"/>
       </w:tblGrid>
       <w:tr>
         <w:tc>
           <w:tcPr>
-            <w:tcW w:type="dxa" w:w="1728"/>
+            <w:tcW w:type="dxa" w:w="960"/>
           </w:tcPr>
           <w:p>
             <w:r/>
@@ -72,7 +76,7 @@
         </w:tc>
         <w:tc>
           <w:tcPr>
-            <w:tcW w:type="dxa" w:w="1728"/>
+            <w:tcW w:type="dxa" w:w="960"/>
           </w:tcPr>
           <w:p>
             <w:r/>
@@ -87,7 +91,7 @@
         </w:tc>
         <w:tc>
           <w:tcPr>
-            <w:tcW w:type="dxa" w:w="1728"/>
+            <w:tcW w:type="dxa" w:w="960"/>
           </w:tcPr>
           <w:p>
             <w:r/>
@@ -96,13 +100,43 @@
                 <w:b/>
                 <w:sz w:val="18"/>
               </w:rPr>
+              <w:t>CATBOOST</w:t>
+            </w:r>
+          </w:p>
+        </w:tc>
+        <w:tc>
+          <w:tcPr>
+            <w:tcW w:type="dxa" w:w="960"/>
+          </w:tcPr>
+          <w:p>
+            <w:r/>
+            <w:r>
+              <w:rPr>
+                <w:b/>
+                <w:sz w:val="18"/>
+              </w:rPr>
+              <w:t>HGB</w:t>
+            </w:r>
+          </w:p>
+        </w:tc>
+        <w:tc>
+          <w:tcPr>
+            <w:tcW w:type="dxa" w:w="960"/>
+          </w:tcPr>
+          <w:p>
+            <w:r/>
+            <w:r>
+              <w:rPr>
+                <w:b/>
+                <w:sz w:val="18"/>
+              </w:rPr>
               <w:t>RF</w:t>
             </w:r>
           </w:p>
         </w:tc>
         <w:tc>
           <w:tcPr>
-            <w:tcW w:type="dxa" w:w="1728"/>
+            <w:tcW w:type="dxa" w:w="960"/>
           </w:tcPr>
           <w:p>
             <w:r/>
@@ -111,13 +145,43 @@
                 <w:b/>
                 <w:sz w:val="18"/>
               </w:rPr>
+              <w:t>ET</w:t>
+            </w:r>
+          </w:p>
+        </w:tc>
+        <w:tc>
+          <w:tcPr>
+            <w:tcW w:type="dxa" w:w="960"/>
+          </w:tcPr>
+          <w:p>
+            <w:r/>
+            <w:r>
+              <w:rPr>
+                <w:b/>
+                <w:sz w:val="18"/>
+              </w:rPr>
+              <w:t>SVM</w:t>
+            </w:r>
+          </w:p>
+        </w:tc>
+        <w:tc>
+          <w:tcPr>
+            <w:tcW w:type="dxa" w:w="960"/>
+          </w:tcPr>
+          <w:p>
+            <w:r/>
+            <w:r>
+              <w:rPr>
+                <w:b/>
+                <w:sz w:val="18"/>
+              </w:rPr>
               <w:t>MLP</w:t>
             </w:r>
           </w:p>
         </w:tc>
         <w:tc>
           <w:tcPr>
-            <w:tcW w:type="dxa" w:w="1728"/>
+            <w:tcW w:type="dxa" w:w="960"/>
           </w:tcPr>
           <w:p>
             <w:r/>
@@ -134,7 +198,7 @@
       <w:tr>
         <w:tc>
           <w:tcPr>
-            <w:tcW w:type="dxa" w:w="1728"/>
+            <w:tcW w:type="dxa" w:w="960"/>
           </w:tcPr>
           <w:p>
             <w:r/>
@@ -149,7 +213,7 @@
         </w:tc>
         <w:tc>
           <w:tcPr>
-            <w:tcW w:type="dxa" w:w="1728"/>
+            <w:tcW w:type="dxa" w:w="960"/>
           </w:tcPr>
           <w:p>
             <w:r/>
@@ -164,7 +228,37 @@
         </w:tc>
         <w:tc>
           <w:tcPr>
-            <w:tcW w:type="dxa" w:w="1728"/>
+            <w:tcW w:type="dxa" w:w="960"/>
+          </w:tcPr>
+          <w:p>
+            <w:r/>
+            <w:r>
+              <w:rPr>
+                <w:b w:val="0"/>
+                <w:sz w:val="18"/>
+              </w:rPr>
+              <w:t>0.821</w:t>
+            </w:r>
+          </w:p>
+        </w:tc>
+        <w:tc>
+          <w:tcPr>
+            <w:tcW w:type="dxa" w:w="960"/>
+          </w:tcPr>
+          <w:p>
+            <w:r/>
+            <w:r>
+              <w:rPr>
+                <w:b w:val="0"/>
+                <w:sz w:val="18"/>
+              </w:rPr>
+              <w:t>0.843</w:t>
+            </w:r>
+          </w:p>
+        </w:tc>
+        <w:tc>
+          <w:tcPr>
+            <w:tcW w:type="dxa" w:w="960"/>
           </w:tcPr>
           <w:p>
             <w:r/>
@@ -179,7 +273,37 @@
         </w:tc>
         <w:tc>
           <w:tcPr>
-            <w:tcW w:type="dxa" w:w="1728"/>
+            <w:tcW w:type="dxa" w:w="960"/>
+          </w:tcPr>
+          <w:p>
+            <w:r/>
+            <w:r>
+              <w:rPr>
+                <w:b w:val="0"/>
+                <w:sz w:val="18"/>
+              </w:rPr>
+              <w:t>0.797</w:t>
+            </w:r>
+          </w:p>
+        </w:tc>
+        <w:tc>
+          <w:tcPr>
+            <w:tcW w:type="dxa" w:w="960"/>
+          </w:tcPr>
+          <w:p>
+            <w:r/>
+            <w:r>
+              <w:rPr>
+                <w:b w:val="0"/>
+                <w:sz w:val="18"/>
+              </w:rPr>
+              <w:t>0.811</w:t>
+            </w:r>
+          </w:p>
+        </w:tc>
+        <w:tc>
+          <w:tcPr>
+            <w:tcW w:type="dxa" w:w="960"/>
           </w:tcPr>
           <w:p>
             <w:r/>
@@ -194,7 +318,7 @@
         </w:tc>
         <w:tc>
           <w:tcPr>
-            <w:tcW w:type="dxa" w:w="1728"/>
+            <w:tcW w:type="dxa" w:w="960"/>
           </w:tcPr>
           <w:p>
             <w:r/>
@@ -211,7 +335,7 @@
       <w:tr>
         <w:tc>
           <w:tcPr>
-            <w:tcW w:type="dxa" w:w="1728"/>
+            <w:tcW w:type="dxa" w:w="960"/>
           </w:tcPr>
           <w:p>
             <w:r/>
@@ -226,7 +350,7 @@
         </w:tc>
         <w:tc>
           <w:tcPr>
-            <w:tcW w:type="dxa" w:w="1728"/>
+            <w:tcW w:type="dxa" w:w="960"/>
           </w:tcPr>
           <w:p>
             <w:r/>
@@ -241,7 +365,37 @@
         </w:tc>
         <w:tc>
           <w:tcPr>
-            <w:tcW w:type="dxa" w:w="1728"/>
+            <w:tcW w:type="dxa" w:w="960"/>
+          </w:tcPr>
+          <w:p>
+            <w:r/>
+            <w:r>
+              <w:rPr>
+                <w:b w:val="0"/>
+                <w:sz w:val="18"/>
+              </w:rPr>
+              <w:t>0.786</w:t>
+            </w:r>
+          </w:p>
+        </w:tc>
+        <w:tc>
+          <w:tcPr>
+            <w:tcW w:type="dxa" w:w="960"/>
+          </w:tcPr>
+          <w:p>
+            <w:r/>
+            <w:r>
+              <w:rPr>
+                <w:b w:val="0"/>
+                <w:sz w:val="18"/>
+              </w:rPr>
+              <w:t>0.811</w:t>
+            </w:r>
+          </w:p>
+        </w:tc>
+        <w:tc>
+          <w:tcPr>
+            <w:tcW w:type="dxa" w:w="960"/>
           </w:tcPr>
           <w:p>
             <w:r/>
@@ -256,7 +410,37 @@
         </w:tc>
         <w:tc>
           <w:tcPr>
-            <w:tcW w:type="dxa" w:w="1728"/>
+            <w:tcW w:type="dxa" w:w="960"/>
+          </w:tcPr>
+          <w:p>
+            <w:r/>
+            <w:r>
+              <w:rPr>
+                <w:b w:val="0"/>
+                <w:sz w:val="18"/>
+              </w:rPr>
+              <w:t>0.757</w:t>
+            </w:r>
+          </w:p>
+        </w:tc>
+        <w:tc>
+          <w:tcPr>
+            <w:tcW w:type="dxa" w:w="960"/>
+          </w:tcPr>
+          <w:p>
+            <w:r/>
+            <w:r>
+              <w:rPr>
+                <w:b w:val="0"/>
+                <w:sz w:val="18"/>
+              </w:rPr>
+              <w:t>0.775</w:t>
+            </w:r>
+          </w:p>
+        </w:tc>
+        <w:tc>
+          <w:tcPr>
+            <w:tcW w:type="dxa" w:w="960"/>
           </w:tcPr>
           <w:p>
             <w:r/>
@@ -271,7 +455,7 @@
         </w:tc>
         <w:tc>
           <w:tcPr>
-            <w:tcW w:type="dxa" w:w="1728"/>
+            <w:tcW w:type="dxa" w:w="960"/>
           </w:tcPr>
           <w:p>
             <w:r/>
@@ -288,7 +472,7 @@
       <w:tr>
         <w:tc>
           <w:tcPr>
-            <w:tcW w:type="dxa" w:w="1728"/>
+            <w:tcW w:type="dxa" w:w="960"/>
           </w:tcPr>
           <w:p>
             <w:r/>
@@ -303,7 +487,7 @@
         </w:tc>
         <w:tc>
           <w:tcPr>
-            <w:tcW w:type="dxa" w:w="1728"/>
+            <w:tcW w:type="dxa" w:w="960"/>
           </w:tcPr>
           <w:p>
             <w:r/>
@@ -318,7 +502,37 @@
         </w:tc>
         <w:tc>
           <w:tcPr>
-            <w:tcW w:type="dxa" w:w="1728"/>
+            <w:tcW w:type="dxa" w:w="960"/>
+          </w:tcPr>
+          <w:p>
+            <w:r/>
+            <w:r>
+              <w:rPr>
+                <w:b w:val="0"/>
+                <w:sz w:val="18"/>
+              </w:rPr>
+              <w:t>0.881</w:t>
+            </w:r>
+          </w:p>
+        </w:tc>
+        <w:tc>
+          <w:tcPr>
+            <w:tcW w:type="dxa" w:w="960"/>
+          </w:tcPr>
+          <w:p>
+            <w:r/>
+            <w:r>
+              <w:rPr>
+                <w:b w:val="0"/>
+                <w:sz w:val="18"/>
+              </w:rPr>
+              <w:t>0.899</w:t>
+            </w:r>
+          </w:p>
+        </w:tc>
+        <w:tc>
+          <w:tcPr>
+            <w:tcW w:type="dxa" w:w="960"/>
           </w:tcPr>
           <w:p>
             <w:r/>
@@ -333,7 +547,37 @@
         </w:tc>
         <w:tc>
           <w:tcPr>
-            <w:tcW w:type="dxa" w:w="1728"/>
+            <w:tcW w:type="dxa" w:w="960"/>
+          </w:tcPr>
+          <w:p>
+            <w:r/>
+            <w:r>
+              <w:rPr>
+                <w:b w:val="0"/>
+                <w:sz w:val="18"/>
+              </w:rPr>
+              <w:t>0.867</w:t>
+            </w:r>
+          </w:p>
+        </w:tc>
+        <w:tc>
+          <w:tcPr>
+            <w:tcW w:type="dxa" w:w="960"/>
+          </w:tcPr>
+          <w:p>
+            <w:r/>
+            <w:r>
+              <w:rPr>
+                <w:b w:val="0"/>
+                <w:sz w:val="18"/>
+              </w:rPr>
+              <w:t>0.848</w:t>
+            </w:r>
+          </w:p>
+        </w:tc>
+        <w:tc>
+          <w:tcPr>
+            <w:tcW w:type="dxa" w:w="960"/>
           </w:tcPr>
           <w:p>
             <w:r/>
@@ -348,7 +592,7 @@
         </w:tc>
         <w:tc>
           <w:tcPr>
-            <w:tcW w:type="dxa" w:w="1728"/>
+            <w:tcW w:type="dxa" w:w="960"/>
           </w:tcPr>
           <w:p>
             <w:r/>
@@ -365,7 +609,7 @@
       <w:tr>
         <w:tc>
           <w:tcPr>
-            <w:tcW w:type="dxa" w:w="1728"/>
+            <w:tcW w:type="dxa" w:w="960"/>
           </w:tcPr>
           <w:p>
             <w:r/>
@@ -380,7 +624,7 @@
         </w:tc>
         <w:tc>
           <w:tcPr>
-            <w:tcW w:type="dxa" w:w="1728"/>
+            <w:tcW w:type="dxa" w:w="960"/>
           </w:tcPr>
           <w:p>
             <w:r/>
@@ -395,7 +639,37 @@
         </w:tc>
         <w:tc>
           <w:tcPr>
-            <w:tcW w:type="dxa" w:w="1728"/>
+            <w:tcW w:type="dxa" w:w="960"/>
+          </w:tcPr>
+          <w:p>
+            <w:r/>
+            <w:r>
+              <w:rPr>
+                <w:b w:val="0"/>
+                <w:sz w:val="18"/>
+              </w:rPr>
+              <w:t>0.794</w:t>
+            </w:r>
+          </w:p>
+        </w:tc>
+        <w:tc>
+          <w:tcPr>
+            <w:tcW w:type="dxa" w:w="960"/>
+          </w:tcPr>
+          <w:p>
+            <w:r/>
+            <w:r>
+              <w:rPr>
+                <w:b w:val="0"/>
+                <w:sz w:val="18"/>
+              </w:rPr>
+              <w:t>0.835</w:t>
+            </w:r>
+          </w:p>
+        </w:tc>
+        <w:tc>
+          <w:tcPr>
+            <w:tcW w:type="dxa" w:w="960"/>
           </w:tcPr>
           <w:p>
             <w:r/>
@@ -410,7 +684,37 @@
         </w:tc>
         <w:tc>
           <w:tcPr>
-            <w:tcW w:type="dxa" w:w="1728"/>
+            <w:tcW w:type="dxa" w:w="960"/>
+          </w:tcPr>
+          <w:p>
+            <w:r/>
+            <w:r>
+              <w:rPr>
+                <w:b w:val="0"/>
+                <w:sz w:val="18"/>
+              </w:rPr>
+              <w:t>0.767</w:t>
+            </w:r>
+          </w:p>
+        </w:tc>
+        <w:tc>
+          <w:tcPr>
+            <w:tcW w:type="dxa" w:w="960"/>
+          </w:tcPr>
+          <w:p>
+            <w:r/>
+            <w:r>
+              <w:rPr>
+                <w:b w:val="0"/>
+                <w:sz w:val="18"/>
+              </w:rPr>
+              <w:t>0.810</w:t>
+            </w:r>
+          </w:p>
+        </w:tc>
+        <w:tc>
+          <w:tcPr>
+            <w:tcW w:type="dxa" w:w="960"/>
           </w:tcPr>
           <w:p>
             <w:r/>
@@ -425,7 +729,7 @@
         </w:tc>
         <w:tc>
           <w:tcPr>
-            <w:tcW w:type="dxa" w:w="1728"/>
+            <w:tcW w:type="dxa" w:w="960"/>
           </w:tcPr>
           <w:p>
             <w:r/>
@@ -442,7 +746,7 @@
       <w:tr>
         <w:tc>
           <w:tcPr>
-            <w:tcW w:type="dxa" w:w="1728"/>
+            <w:tcW w:type="dxa" w:w="960"/>
           </w:tcPr>
           <w:p>
             <w:r/>
@@ -457,7 +761,7 @@
         </w:tc>
         <w:tc>
           <w:tcPr>
-            <w:tcW w:type="dxa" w:w="1728"/>
+            <w:tcW w:type="dxa" w:w="960"/>
           </w:tcPr>
           <w:p>
             <w:r/>
@@ -472,7 +776,37 @@
         </w:tc>
         <w:tc>
           <w:tcPr>
-            <w:tcW w:type="dxa" w:w="1728"/>
+            <w:tcW w:type="dxa" w:w="960"/>
+          </w:tcPr>
+          <w:p>
+            <w:r/>
+            <w:r>
+              <w:rPr>
+                <w:b w:val="0"/>
+                <w:sz w:val="18"/>
+              </w:rPr>
+              <w:t>0.091</w:t>
+            </w:r>
+          </w:p>
+        </w:tc>
+        <w:tc>
+          <w:tcPr>
+            <w:tcW w:type="dxa" w:w="960"/>
+          </w:tcPr>
+          <w:p>
+            <w:r/>
+            <w:r>
+              <w:rPr>
+                <w:b w:val="0"/>
+                <w:sz w:val="18"/>
+              </w:rPr>
+              <w:t>0.022</w:t>
+            </w:r>
+          </w:p>
+        </w:tc>
+        <w:tc>
+          <w:tcPr>
+            <w:tcW w:type="dxa" w:w="960"/>
           </w:tcPr>
           <w:p>
             <w:r/>
@@ -487,7 +821,37 @@
         </w:tc>
         <w:tc>
           <w:tcPr>
-            <w:tcW w:type="dxa" w:w="1728"/>
+            <w:tcW w:type="dxa" w:w="960"/>
+          </w:tcPr>
+          <w:p>
+            <w:r/>
+            <w:r>
+              <w:rPr>
+                <w:b w:val="0"/>
+                <w:sz w:val="18"/>
+              </w:rPr>
+              <w:t>0.172</w:t>
+            </w:r>
+          </w:p>
+        </w:tc>
+        <w:tc>
+          <w:tcPr>
+            <w:tcW w:type="dxa" w:w="960"/>
+          </w:tcPr>
+          <w:p>
+            <w:r/>
+            <w:r>
+              <w:rPr>
+                <w:b w:val="0"/>
+                <w:sz w:val="18"/>
+              </w:rPr>
+              <w:t>0.056</w:t>
+            </w:r>
+          </w:p>
+        </w:tc>
+        <w:tc>
+          <w:tcPr>
+            <w:tcW w:type="dxa" w:w="960"/>
           </w:tcPr>
           <w:p>
             <w:r/>
@@ -502,7 +866,7 @@
         </w:tc>
         <w:tc>
           <w:tcPr>
-            <w:tcW w:type="dxa" w:w="1728"/>
+            <w:tcW w:type="dxa" w:w="960"/>
           </w:tcPr>
           <w:p>
             <w:r/>
@@ -519,7 +883,7 @@
       <w:tr>
         <w:tc>
           <w:tcPr>
-            <w:tcW w:type="dxa" w:w="1728"/>
+            <w:tcW w:type="dxa" w:w="960"/>
           </w:tcPr>
           <w:p>
             <w:r/>
@@ -534,7 +898,7 @@
         </w:tc>
         <w:tc>
           <w:tcPr>
-            <w:tcW w:type="dxa" w:w="1728"/>
+            <w:tcW w:type="dxa" w:w="960"/>
           </w:tcPr>
           <w:p>
             <w:r/>
@@ -549,7 +913,37 @@
         </w:tc>
         <w:tc>
           <w:tcPr>
-            <w:tcW w:type="dxa" w:w="1728"/>
+            <w:tcW w:type="dxa" w:w="960"/>
+          </w:tcPr>
+          <w:p>
+            <w:r/>
+            <w:r>
+              <w:rPr>
+                <w:b w:val="0"/>
+                <w:sz w:val="18"/>
+              </w:rPr>
+              <w:t>0.846</w:t>
+            </w:r>
+          </w:p>
+        </w:tc>
+        <w:tc>
+          <w:tcPr>
+            <w:tcW w:type="dxa" w:w="960"/>
+          </w:tcPr>
+          <w:p>
+            <w:r/>
+            <w:r>
+              <w:rPr>
+                <w:b w:val="0"/>
+                <w:sz w:val="18"/>
+              </w:rPr>
+              <w:t>0.943</w:t>
+            </w:r>
+          </w:p>
+        </w:tc>
+        <w:tc>
+          <w:tcPr>
+            <w:tcW w:type="dxa" w:w="960"/>
           </w:tcPr>
           <w:p>
             <w:r/>
@@ -564,7 +958,37 @@
         </w:tc>
         <w:tc>
           <w:tcPr>
-            <w:tcW w:type="dxa" w:w="1728"/>
+            <w:tcW w:type="dxa" w:w="960"/>
+          </w:tcPr>
+          <w:p>
+            <w:r/>
+            <w:r>
+              <w:rPr>
+                <w:b w:val="0"/>
+                <w:sz w:val="18"/>
+              </w:rPr>
+              <w:t>0.730</w:t>
+            </w:r>
+          </w:p>
+        </w:tc>
+        <w:tc>
+          <w:tcPr>
+            <w:tcW w:type="dxa" w:w="960"/>
+          </w:tcPr>
+          <w:p>
+            <w:r/>
+            <w:r>
+              <w:rPr>
+                <w:b w:val="0"/>
+                <w:sz w:val="18"/>
+              </w:rPr>
+              <w:t>0.843</w:t>
+            </w:r>
+          </w:p>
+        </w:tc>
+        <w:tc>
+          <w:tcPr>
+            <w:tcW w:type="dxa" w:w="960"/>
           </w:tcPr>
           <w:p>
             <w:r/>
@@ -579,7 +1003,7 @@
         </w:tc>
         <w:tc>
           <w:tcPr>
-            <w:tcW w:type="dxa" w:w="1728"/>
+            <w:tcW w:type="dxa" w:w="960"/>
           </w:tcPr>
           <w:p>
             <w:r/>
@@ -596,7 +1020,7 @@
       <w:tr>
         <w:tc>
           <w:tcPr>
-            <w:tcW w:type="dxa" w:w="1728"/>
+            <w:tcW w:type="dxa" w:w="960"/>
           </w:tcPr>
           <w:p>
             <w:r/>
@@ -611,7 +1035,7 @@
         </w:tc>
         <w:tc>
           <w:tcPr>
-            <w:tcW w:type="dxa" w:w="1728"/>
+            <w:tcW w:type="dxa" w:w="960"/>
           </w:tcPr>
           <w:p>
             <w:r/>
@@ -626,7 +1050,37 @@
         </w:tc>
         <w:tc>
           <w:tcPr>
-            <w:tcW w:type="dxa" w:w="1728"/>
+            <w:tcW w:type="dxa" w:w="960"/>
+          </w:tcPr>
+          <w:p>
+            <w:r/>
+            <w:r>
+              <w:rPr>
+                <w:b w:val="0"/>
+                <w:sz w:val="18"/>
+              </w:rPr>
+              <w:t>0.444</w:t>
+            </w:r>
+          </w:p>
+        </w:tc>
+        <w:tc>
+          <w:tcPr>
+            <w:tcW w:type="dxa" w:w="960"/>
+          </w:tcPr>
+          <w:p>
+            <w:r/>
+            <w:r>
+              <w:rPr>
+                <w:b w:val="0"/>
+                <w:sz w:val="18"/>
+              </w:rPr>
+              <w:t>0.671</w:t>
+            </w:r>
+          </w:p>
+        </w:tc>
+        <w:tc>
+          <w:tcPr>
+            <w:tcW w:type="dxa" w:w="960"/>
           </w:tcPr>
           <w:p>
             <w:r/>
@@ -641,7 +1095,37 @@
         </w:tc>
         <w:tc>
           <w:tcPr>
-            <w:tcW w:type="dxa" w:w="1728"/>
+            <w:tcW w:type="dxa" w:w="960"/>
+          </w:tcPr>
+          <w:p>
+            <w:r/>
+            <w:r>
+              <w:rPr>
+                <w:b w:val="0"/>
+                <w:sz w:val="18"/>
+              </w:rPr>
+              <w:t>0.471</w:t>
+            </w:r>
+          </w:p>
+        </w:tc>
+        <w:tc>
+          <w:tcPr>
+            <w:tcW w:type="dxa" w:w="960"/>
+          </w:tcPr>
+          <w:p>
+            <w:r/>
+            <w:r>
+              <w:rPr>
+                <w:b w:val="0"/>
+                <w:sz w:val="18"/>
+              </w:rPr>
+              <w:t>0.537</w:t>
+            </w:r>
+          </w:p>
+        </w:tc>
+        <w:tc>
+          <w:tcPr>
+            <w:tcW w:type="dxa" w:w="960"/>
           </w:tcPr>
           <w:p>
             <w:r/>
@@ -656,7 +1140,7 @@
         </w:tc>
         <w:tc>
           <w:tcPr>
-            <w:tcW w:type="dxa" w:w="1728"/>
+            <w:tcW w:type="dxa" w:w="960"/>
           </w:tcPr>
           <w:p>
             <w:r/>
@@ -673,7 +1157,7 @@
       <w:tr>
         <w:tc>
           <w:tcPr>
-            <w:tcW w:type="dxa" w:w="1728"/>
+            <w:tcW w:type="dxa" w:w="960"/>
           </w:tcPr>
           <w:p>
             <w:r/>
@@ -688,7 +1172,7 @@
         </w:tc>
         <w:tc>
           <w:tcPr>
-            <w:tcW w:type="dxa" w:w="1728"/>
+            <w:tcW w:type="dxa" w:w="960"/>
           </w:tcPr>
           <w:p>
             <w:r/>
@@ -703,7 +1187,37 @@
         </w:tc>
         <w:tc>
           <w:tcPr>
-            <w:tcW w:type="dxa" w:w="1728"/>
+            <w:tcW w:type="dxa" w:w="960"/>
+          </w:tcPr>
+          <w:p>
+            <w:r/>
+            <w:r>
+              <w:rPr>
+                <w:b w:val="0"/>
+                <w:sz w:val="18"/>
+              </w:rPr>
+              <w:t>3</w:t>
+            </w:r>
+          </w:p>
+        </w:tc>
+        <w:tc>
+          <w:tcPr>
+            <w:tcW w:type="dxa" w:w="960"/>
+          </w:tcPr>
+          <w:p>
+            <w:r/>
+            <w:r>
+              <w:rPr>
+                <w:b w:val="0"/>
+                <w:sz w:val="18"/>
+              </w:rPr>
+              <w:t>23</w:t>
+            </w:r>
+          </w:p>
+        </w:tc>
+        <w:tc>
+          <w:tcPr>
+            <w:tcW w:type="dxa" w:w="960"/>
           </w:tcPr>
           <w:p>
             <w:r/>
@@ -718,7 +1232,37 @@
         </w:tc>
         <w:tc>
           <w:tcPr>
-            <w:tcW w:type="dxa" w:w="1728"/>
+            <w:tcW w:type="dxa" w:w="960"/>
+          </w:tcPr>
+          <w:p>
+            <w:r/>
+            <w:r>
+              <w:rPr>
+                <w:b w:val="0"/>
+                <w:sz w:val="18"/>
+              </w:rPr>
+              <w:t>998</w:t>
+            </w:r>
+          </w:p>
+        </w:tc>
+        <w:tc>
+          <w:tcPr>
+            <w:tcW w:type="dxa" w:w="960"/>
+          </w:tcPr>
+          <w:p>
+            <w:r/>
+            <w:r>
+              <w:rPr>
+                <w:b w:val="0"/>
+                <w:sz w:val="18"/>
+              </w:rPr>
+              <w:t>11</w:t>
+            </w:r>
+          </w:p>
+        </w:tc>
+        <w:tc>
+          <w:tcPr>
+            <w:tcW w:type="dxa" w:w="960"/>
           </w:tcPr>
           <w:p>
             <w:r/>
@@ -733,7 +1277,7 @@
         </w:tc>
         <w:tc>
           <w:tcPr>
-            <w:tcW w:type="dxa" w:w="1728"/>
+            <w:tcW w:type="dxa" w:w="960"/>
           </w:tcPr>
           <w:p>
             <w:r/>
@@ -750,7 +1294,7 @@
       <w:tr>
         <w:tc>
           <w:tcPr>
-            <w:tcW w:type="dxa" w:w="1728"/>
+            <w:tcW w:type="dxa" w:w="960"/>
           </w:tcPr>
           <w:p>
             <w:r/>
@@ -765,7 +1309,7 @@
         </w:tc>
         <w:tc>
           <w:tcPr>
-            <w:tcW w:type="dxa" w:w="1728"/>
+            <w:tcW w:type="dxa" w:w="960"/>
           </w:tcPr>
           <w:p>
             <w:r/>
@@ -780,7 +1324,37 @@
         </w:tc>
         <w:tc>
           <w:tcPr>
-            <w:tcW w:type="dxa" w:w="1728"/>
+            <w:tcW w:type="dxa" w:w="960"/>
+          </w:tcPr>
+          <w:p>
+            <w:r/>
+            <w:r>
+              <w:rPr>
+                <w:b w:val="0"/>
+                <w:sz w:val="18"/>
+              </w:rPr>
+              <w:t>307</w:t>
+            </w:r>
+          </w:p>
+        </w:tc>
+        <w:tc>
+          <w:tcPr>
+            <w:tcW w:type="dxa" w:w="960"/>
+          </w:tcPr>
+          <w:p>
+            <w:r/>
+            <w:r>
+              <w:rPr>
+                <w:b w:val="0"/>
+                <w:sz w:val="18"/>
+              </w:rPr>
+              <w:t>160</w:t>
+            </w:r>
+          </w:p>
+        </w:tc>
+        <w:tc>
+          <w:tcPr>
+            <w:tcW w:type="dxa" w:w="960"/>
           </w:tcPr>
           <w:p>
             <w:r/>
@@ -795,7 +1369,37 @@
         </w:tc>
         <w:tc>
           <w:tcPr>
-            <w:tcW w:type="dxa" w:w="1728"/>
+            <w:tcW w:type="dxa" w:w="960"/>
+          </w:tcPr>
+          <w:p>
+            <w:r/>
+            <w:r>
+              <w:rPr>
+                <w:b w:val="0"/>
+                <w:sz w:val="18"/>
+              </w:rPr>
+              <w:t>29</w:t>
+            </w:r>
+          </w:p>
+        </w:tc>
+        <w:tc>
+          <w:tcPr>
+            <w:tcW w:type="dxa" w:w="960"/>
+          </w:tcPr>
+          <w:p>
+            <w:r/>
+            <w:r>
+              <w:rPr>
+                <w:b w:val="0"/>
+                <w:sz w:val="18"/>
+              </w:rPr>
+              <w:t>80</w:t>
+            </w:r>
+          </w:p>
+        </w:tc>
+        <w:tc>
+          <w:tcPr>
+            <w:tcW w:type="dxa" w:w="960"/>
           </w:tcPr>
           <w:p>
             <w:r/>
@@ -810,7 +1414,7 @@
         </w:tc>
         <w:tc>
           <w:tcPr>
-            <w:tcW w:type="dxa" w:w="1728"/>
+            <w:tcW w:type="dxa" w:w="960"/>
           </w:tcPr>
           <w:p>
             <w:r/>
@@ -876,7 +1480,7 @@
     </w:p>
     <w:p>
       <w:r>
-        <w:t>Paper-style cost/quality scatter: x = model size on disk (log scale, smaller is better), y = real-eval macro-F1 (higher is better), bubble area = confidence separation (mean conf when correct minus when wrong — the bigger the bubble the more usable the Phase 5 idle threshold). Points on the green dashed line are Pareto-optimal (nothing beats them on both axes); the gold star is the locked pick. LightGBM edges MLP on F1 but at 100x the size and a third of the confidence spread; RandomForest is off the frontier entirely — LightGBM beats it on F1 at 12x smaller.</w:t>
+        <w:t>Paper-style cost/quality scatter: x = model size on disk (log scale, smaller is better), y = real-eval macro-F1 (higher is better), bubble area = confidence separation (mean conf when correct minus when wrong — the bigger the bubble the more usable the Phase 5 idle threshold). Points on the green dashed line are Pareto-optimal (nothing beats them on both axes); the gold star is the locked pick. Only LightGBM and MLP sit on the frontier: LightGBM edges MLP on F1 but at 100x the size and a third of the confidence spread. Every other candidate — including CatBoost and HistGradientBoosting, run to close the GBDT-family gap — is dominated: 3–11 real-eval points behind LightGBM at equal or larger size. The GBDT family does not cluster (section 8).</w:t>
       </w:r>
     </w:p>
     <w:p>
@@ -930,16 +1534,20 @@
         <w:tblLook w:firstColumn="1" w:firstRow="1" w:lastColumn="0" w:lastRow="0" w:noHBand="0" w:noVBand="1" w:val="04A0"/>
       </w:tblPr>
       <w:tblGrid>
-        <w:gridCol w:w="1728"/>
-        <w:gridCol w:w="1728"/>
-        <w:gridCol w:w="1728"/>
-        <w:gridCol w:w="1728"/>
-        <w:gridCol w:w="1728"/>
+        <w:gridCol w:w="960"/>
+        <w:gridCol w:w="960"/>
+        <w:gridCol w:w="960"/>
+        <w:gridCol w:w="960"/>
+        <w:gridCol w:w="960"/>
+        <w:gridCol w:w="960"/>
+        <w:gridCol w:w="960"/>
+        <w:gridCol w:w="960"/>
+        <w:gridCol w:w="960"/>
       </w:tblGrid>
       <w:tr>
         <w:tc>
           <w:tcPr>
-            <w:tcW w:type="dxa" w:w="1728"/>
+            <w:tcW w:type="dxa" w:w="960"/>
           </w:tcPr>
           <w:p>
             <w:r/>
@@ -954,7 +1562,7 @@
         </w:tc>
         <w:tc>
           <w:tcPr>
-            <w:tcW w:type="dxa" w:w="1728"/>
+            <w:tcW w:type="dxa" w:w="960"/>
           </w:tcPr>
           <w:p>
             <w:r/>
@@ -969,7 +1577,7 @@
         </w:tc>
         <w:tc>
           <w:tcPr>
-            <w:tcW w:type="dxa" w:w="1728"/>
+            <w:tcW w:type="dxa" w:w="960"/>
           </w:tcPr>
           <w:p>
             <w:r/>
@@ -978,13 +1586,43 @@
                 <w:b/>
                 <w:sz w:val="18"/>
               </w:rPr>
+              <w:t>CATBOOST</w:t>
+            </w:r>
+          </w:p>
+        </w:tc>
+        <w:tc>
+          <w:tcPr>
+            <w:tcW w:type="dxa" w:w="960"/>
+          </w:tcPr>
+          <w:p>
+            <w:r/>
+            <w:r>
+              <w:rPr>
+                <w:b/>
+                <w:sz w:val="18"/>
+              </w:rPr>
+              <w:t>HGB</w:t>
+            </w:r>
+          </w:p>
+        </w:tc>
+        <w:tc>
+          <w:tcPr>
+            <w:tcW w:type="dxa" w:w="960"/>
+          </w:tcPr>
+          <w:p>
+            <w:r/>
+            <w:r>
+              <w:rPr>
+                <w:b/>
+                <w:sz w:val="18"/>
+              </w:rPr>
               <w:t>RF</w:t>
             </w:r>
           </w:p>
         </w:tc>
         <w:tc>
           <w:tcPr>
-            <w:tcW w:type="dxa" w:w="1728"/>
+            <w:tcW w:type="dxa" w:w="960"/>
           </w:tcPr>
           <w:p>
             <w:r/>
@@ -993,13 +1631,43 @@
                 <w:b/>
                 <w:sz w:val="18"/>
               </w:rPr>
+              <w:t>ET</w:t>
+            </w:r>
+          </w:p>
+        </w:tc>
+        <w:tc>
+          <w:tcPr>
+            <w:tcW w:type="dxa" w:w="960"/>
+          </w:tcPr>
+          <w:p>
+            <w:r/>
+            <w:r>
+              <w:rPr>
+                <w:b/>
+                <w:sz w:val="18"/>
+              </w:rPr>
+              <w:t>SVM</w:t>
+            </w:r>
+          </w:p>
+        </w:tc>
+        <w:tc>
+          <w:tcPr>
+            <w:tcW w:type="dxa" w:w="960"/>
+          </w:tcPr>
+          <w:p>
+            <w:r/>
+            <w:r>
+              <w:rPr>
+                <w:b/>
+                <w:sz w:val="18"/>
+              </w:rPr>
               <w:t>MLP</w:t>
             </w:r>
           </w:p>
         </w:tc>
         <w:tc>
           <w:tcPr>
-            <w:tcW w:type="dxa" w:w="1728"/>
+            <w:tcW w:type="dxa" w:w="960"/>
           </w:tcPr>
           <w:p>
             <w:r/>
@@ -1016,7 +1684,7 @@
       <w:tr>
         <w:tc>
           <w:tcPr>
-            <w:tcW w:type="dxa" w:w="1728"/>
+            <w:tcW w:type="dxa" w:w="960"/>
           </w:tcPr>
           <w:p>
             <w:r/>
@@ -1031,7 +1699,7 @@
         </w:tc>
         <w:tc>
           <w:tcPr>
-            <w:tcW w:type="dxa" w:w="1728"/>
+            <w:tcW w:type="dxa" w:w="960"/>
           </w:tcPr>
           <w:p>
             <w:r/>
@@ -1046,7 +1714,37 @@
         </w:tc>
         <w:tc>
           <w:tcPr>
-            <w:tcW w:type="dxa" w:w="1728"/>
+            <w:tcW w:type="dxa" w:w="960"/>
+          </w:tcPr>
+          <w:p>
+            <w:r/>
+            <w:r>
+              <w:rPr>
+                <w:b w:val="0"/>
+                <w:sz w:val="18"/>
+              </w:rPr>
+              <w:t>0.67</w:t>
+            </w:r>
+          </w:p>
+        </w:tc>
+        <w:tc>
+          <w:tcPr>
+            <w:tcW w:type="dxa" w:w="960"/>
+          </w:tcPr>
+          <w:p>
+            <w:r/>
+            <w:r>
+              <w:rPr>
+                <w:b w:val="0"/>
+                <w:sz w:val="18"/>
+              </w:rPr>
+              <w:t>0.60</w:t>
+            </w:r>
+          </w:p>
+        </w:tc>
+        <w:tc>
+          <w:tcPr>
+            <w:tcW w:type="dxa" w:w="960"/>
           </w:tcPr>
           <w:p>
             <w:r/>
@@ -1061,7 +1759,37 @@
         </w:tc>
         <w:tc>
           <w:tcPr>
-            <w:tcW w:type="dxa" w:w="1728"/>
+            <w:tcW w:type="dxa" w:w="960"/>
+          </w:tcPr>
+          <w:p>
+            <w:r/>
+            <w:r>
+              <w:rPr>
+                <w:b w:val="0"/>
+                <w:sz w:val="18"/>
+              </w:rPr>
+              <w:t>0.19</w:t>
+            </w:r>
+          </w:p>
+        </w:tc>
+        <w:tc>
+          <w:tcPr>
+            <w:tcW w:type="dxa" w:w="960"/>
+          </w:tcPr>
+          <w:p>
+            <w:r/>
+            <w:r>
+              <w:rPr>
+                <w:b w:val="0"/>
+                <w:sz w:val="18"/>
+              </w:rPr>
+              <w:t>0.43</w:t>
+            </w:r>
+          </w:p>
+        </w:tc>
+        <w:tc>
+          <w:tcPr>
+            <w:tcW w:type="dxa" w:w="960"/>
           </w:tcPr>
           <w:p>
             <w:r/>
@@ -1076,7 +1804,7 @@
         </w:tc>
         <w:tc>
           <w:tcPr>
-            <w:tcW w:type="dxa" w:w="1728"/>
+            <w:tcW w:type="dxa" w:w="960"/>
           </w:tcPr>
           <w:p>
             <w:r/>
@@ -1093,7 +1821,7 @@
       <w:tr>
         <w:tc>
           <w:tcPr>
-            <w:tcW w:type="dxa" w:w="1728"/>
+            <w:tcW w:type="dxa" w:w="960"/>
           </w:tcPr>
           <w:p>
             <w:r/>
@@ -1108,7 +1836,7 @@
         </w:tc>
         <w:tc>
           <w:tcPr>
-            <w:tcW w:type="dxa" w:w="1728"/>
+            <w:tcW w:type="dxa" w:w="960"/>
           </w:tcPr>
           <w:p>
             <w:r/>
@@ -1123,7 +1851,37 @@
         </w:tc>
         <w:tc>
           <w:tcPr>
-            <w:tcW w:type="dxa" w:w="1728"/>
+            <w:tcW w:type="dxa" w:w="960"/>
+          </w:tcPr>
+          <w:p>
+            <w:r/>
+            <w:r>
+              <w:rPr>
+                <w:b w:val="0"/>
+                <w:sz w:val="18"/>
+              </w:rPr>
+              <w:t>0.74</w:t>
+            </w:r>
+          </w:p>
+        </w:tc>
+        <w:tc>
+          <w:tcPr>
+            <w:tcW w:type="dxa" w:w="960"/>
+          </w:tcPr>
+          <w:p>
+            <w:r/>
+            <w:r>
+              <w:rPr>
+                <w:b w:val="0"/>
+                <w:sz w:val="18"/>
+              </w:rPr>
+              <w:t>0.76</w:t>
+            </w:r>
+          </w:p>
+        </w:tc>
+        <w:tc>
+          <w:tcPr>
+            <w:tcW w:type="dxa" w:w="960"/>
           </w:tcPr>
           <w:p>
             <w:r/>
@@ -1138,7 +1896,22 @@
         </w:tc>
         <w:tc>
           <w:tcPr>
-            <w:tcW w:type="dxa" w:w="1728"/>
+            <w:tcW w:type="dxa" w:w="960"/>
+          </w:tcPr>
+          <w:p>
+            <w:r/>
+            <w:r>
+              <w:rPr>
+                <w:b w:val="0"/>
+                <w:sz w:val="18"/>
+              </w:rPr>
+              <w:t>0.74</w:t>
+            </w:r>
+          </w:p>
+        </w:tc>
+        <w:tc>
+          <w:tcPr>
+            <w:tcW w:type="dxa" w:w="960"/>
           </w:tcPr>
           <w:p>
             <w:r/>
@@ -1153,7 +1926,22 @@
         </w:tc>
         <w:tc>
           <w:tcPr>
-            <w:tcW w:type="dxa" w:w="1728"/>
+            <w:tcW w:type="dxa" w:w="960"/>
+          </w:tcPr>
+          <w:p>
+            <w:r/>
+            <w:r>
+              <w:rPr>
+                <w:b w:val="0"/>
+                <w:sz w:val="18"/>
+              </w:rPr>
+              <w:t>0.76</w:t>
+            </w:r>
+          </w:p>
+        </w:tc>
+        <w:tc>
+          <w:tcPr>
+            <w:tcW w:type="dxa" w:w="960"/>
           </w:tcPr>
           <w:p>
             <w:r/>
@@ -1170,7 +1958,7 @@
       <w:tr>
         <w:tc>
           <w:tcPr>
-            <w:tcW w:type="dxa" w:w="1728"/>
+            <w:tcW w:type="dxa" w:w="960"/>
           </w:tcPr>
           <w:p>
             <w:r/>
@@ -1185,7 +1973,7 @@
         </w:tc>
         <w:tc>
           <w:tcPr>
-            <w:tcW w:type="dxa" w:w="1728"/>
+            <w:tcW w:type="dxa" w:w="960"/>
           </w:tcPr>
           <w:p>
             <w:r/>
@@ -1200,7 +1988,37 @@
         </w:tc>
         <w:tc>
           <w:tcPr>
-            <w:tcW w:type="dxa" w:w="1728"/>
+            <w:tcW w:type="dxa" w:w="960"/>
+          </w:tcPr>
+          <w:p>
+            <w:r/>
+            <w:r>
+              <w:rPr>
+                <w:b w:val="0"/>
+                <w:sz w:val="18"/>
+              </w:rPr>
+              <w:t>0.66</w:t>
+            </w:r>
+          </w:p>
+        </w:tc>
+        <w:tc>
+          <w:tcPr>
+            <w:tcW w:type="dxa" w:w="960"/>
+          </w:tcPr>
+          <w:p>
+            <w:r/>
+            <w:r>
+              <w:rPr>
+                <w:b w:val="0"/>
+                <w:sz w:val="18"/>
+              </w:rPr>
+              <w:t>0.82</w:t>
+            </w:r>
+          </w:p>
+        </w:tc>
+        <w:tc>
+          <w:tcPr>
+            <w:tcW w:type="dxa" w:w="960"/>
           </w:tcPr>
           <w:p>
             <w:r/>
@@ -1215,7 +2033,37 @@
         </w:tc>
         <w:tc>
           <w:tcPr>
-            <w:tcW w:type="dxa" w:w="1728"/>
+            <w:tcW w:type="dxa" w:w="960"/>
+          </w:tcPr>
+          <w:p>
+            <w:r/>
+            <w:r>
+              <w:rPr>
+                <w:b w:val="0"/>
+                <w:sz w:val="18"/>
+              </w:rPr>
+              <w:t>0.79</w:t>
+            </w:r>
+          </w:p>
+        </w:tc>
+        <w:tc>
+          <w:tcPr>
+            <w:tcW w:type="dxa" w:w="960"/>
+          </w:tcPr>
+          <w:p>
+            <w:r/>
+            <w:r>
+              <w:rPr>
+                <w:b w:val="0"/>
+                <w:sz w:val="18"/>
+              </w:rPr>
+              <w:t>0.76</w:t>
+            </w:r>
+          </w:p>
+        </w:tc>
+        <w:tc>
+          <w:tcPr>
+            <w:tcW w:type="dxa" w:w="960"/>
           </w:tcPr>
           <w:p>
             <w:r/>
@@ -1230,7 +2078,7 @@
         </w:tc>
         <w:tc>
           <w:tcPr>
-            <w:tcW w:type="dxa" w:w="1728"/>
+            <w:tcW w:type="dxa" w:w="960"/>
           </w:tcPr>
           <w:p>
             <w:r/>
@@ -1247,7 +2095,7 @@
       <w:tr>
         <w:tc>
           <w:tcPr>
-            <w:tcW w:type="dxa" w:w="1728"/>
+            <w:tcW w:type="dxa" w:w="960"/>
           </w:tcPr>
           <w:p>
             <w:r/>
@@ -1262,7 +2110,7 @@
         </w:tc>
         <w:tc>
           <w:tcPr>
-            <w:tcW w:type="dxa" w:w="1728"/>
+            <w:tcW w:type="dxa" w:w="960"/>
           </w:tcPr>
           <w:p>
             <w:r/>
@@ -1277,7 +2125,37 @@
         </w:tc>
         <w:tc>
           <w:tcPr>
-            <w:tcW w:type="dxa" w:w="1728"/>
+            <w:tcW w:type="dxa" w:w="960"/>
+          </w:tcPr>
+          <w:p>
+            <w:r/>
+            <w:r>
+              <w:rPr>
+                <w:b w:val="0"/>
+                <w:sz w:val="18"/>
+              </w:rPr>
+              <w:t>0.91</w:t>
+            </w:r>
+          </w:p>
+        </w:tc>
+        <w:tc>
+          <w:tcPr>
+            <w:tcW w:type="dxa" w:w="960"/>
+          </w:tcPr>
+          <w:p>
+            <w:r/>
+            <w:r>
+              <w:rPr>
+                <w:b w:val="0"/>
+                <w:sz w:val="18"/>
+              </w:rPr>
+              <w:t>0.95</w:t>
+            </w:r>
+          </w:p>
+        </w:tc>
+        <w:tc>
+          <w:tcPr>
+            <w:tcW w:type="dxa" w:w="960"/>
           </w:tcPr>
           <w:p>
             <w:r/>
@@ -1292,7 +2170,37 @@
         </w:tc>
         <w:tc>
           <w:tcPr>
-            <w:tcW w:type="dxa" w:w="1728"/>
+            <w:tcW w:type="dxa" w:w="960"/>
+          </w:tcPr>
+          <w:p>
+            <w:r/>
+            <w:r>
+              <w:rPr>
+                <w:b w:val="0"/>
+                <w:sz w:val="18"/>
+              </w:rPr>
+              <w:t>0.89</w:t>
+            </w:r>
+          </w:p>
+        </w:tc>
+        <w:tc>
+          <w:tcPr>
+            <w:tcW w:type="dxa" w:w="960"/>
+          </w:tcPr>
+          <w:p>
+            <w:r/>
+            <w:r>
+              <w:rPr>
+                <w:b w:val="0"/>
+                <w:sz w:val="18"/>
+              </w:rPr>
+              <w:t>0.86</w:t>
+            </w:r>
+          </w:p>
+        </w:tc>
+        <w:tc>
+          <w:tcPr>
+            <w:tcW w:type="dxa" w:w="960"/>
           </w:tcPr>
           <w:p>
             <w:r/>
@@ -1307,7 +2215,7 @@
         </w:tc>
         <w:tc>
           <w:tcPr>
-            <w:tcW w:type="dxa" w:w="1728"/>
+            <w:tcW w:type="dxa" w:w="960"/>
           </w:tcPr>
           <w:p>
             <w:r/>
@@ -1324,7 +2232,7 @@
       <w:tr>
         <w:tc>
           <w:tcPr>
-            <w:tcW w:type="dxa" w:w="1728"/>
+            <w:tcW w:type="dxa" w:w="960"/>
           </w:tcPr>
           <w:p>
             <w:r/>
@@ -1339,7 +2247,7 @@
         </w:tc>
         <w:tc>
           <w:tcPr>
-            <w:tcW w:type="dxa" w:w="1728"/>
+            <w:tcW w:type="dxa" w:w="960"/>
           </w:tcPr>
           <w:p>
             <w:r/>
@@ -1354,7 +2262,7 @@
         </w:tc>
         <w:tc>
           <w:tcPr>
-            <w:tcW w:type="dxa" w:w="1728"/>
+            <w:tcW w:type="dxa" w:w="960"/>
           </w:tcPr>
           <w:p>
             <w:r/>
@@ -1369,7 +2277,7 @@
         </w:tc>
         <w:tc>
           <w:tcPr>
-            <w:tcW w:type="dxa" w:w="1728"/>
+            <w:tcW w:type="dxa" w:w="960"/>
           </w:tcPr>
           <w:p>
             <w:r/>
@@ -1384,7 +2292,67 @@
         </w:tc>
         <w:tc>
           <w:tcPr>
-            <w:tcW w:type="dxa" w:w="1728"/>
+            <w:tcW w:type="dxa" w:w="960"/>
+          </w:tcPr>
+          <w:p>
+            <w:r/>
+            <w:r>
+              <w:rPr>
+                <w:b w:val="0"/>
+                <w:sz w:val="18"/>
+              </w:rPr>
+              <w:t>1.00</w:t>
+            </w:r>
+          </w:p>
+        </w:tc>
+        <w:tc>
+          <w:tcPr>
+            <w:tcW w:type="dxa" w:w="960"/>
+          </w:tcPr>
+          <w:p>
+            <w:r/>
+            <w:r>
+              <w:rPr>
+                <w:b w:val="0"/>
+                <w:sz w:val="18"/>
+              </w:rPr>
+              <w:t>1.00</w:t>
+            </w:r>
+          </w:p>
+        </w:tc>
+        <w:tc>
+          <w:tcPr>
+            <w:tcW w:type="dxa" w:w="960"/>
+          </w:tcPr>
+          <w:p>
+            <w:r/>
+            <w:r>
+              <w:rPr>
+                <w:b w:val="0"/>
+                <w:sz w:val="18"/>
+              </w:rPr>
+              <w:t>0.98</w:t>
+            </w:r>
+          </w:p>
+        </w:tc>
+        <w:tc>
+          <w:tcPr>
+            <w:tcW w:type="dxa" w:w="960"/>
+          </w:tcPr>
+          <w:p>
+            <w:r/>
+            <w:r>
+              <w:rPr>
+                <w:b w:val="0"/>
+                <w:sz w:val="18"/>
+              </w:rPr>
+              <w:t>1.00</w:t>
+            </w:r>
+          </w:p>
+        </w:tc>
+        <w:tc>
+          <w:tcPr>
+            <w:tcW w:type="dxa" w:w="960"/>
           </w:tcPr>
           <w:p>
             <w:r/>
@@ -1401,7 +2369,7 @@
       <w:tr>
         <w:tc>
           <w:tcPr>
-            <w:tcW w:type="dxa" w:w="1728"/>
+            <w:tcW w:type="dxa" w:w="960"/>
           </w:tcPr>
           <w:p>
             <w:r/>
@@ -1416,7 +2384,7 @@
         </w:tc>
         <w:tc>
           <w:tcPr>
-            <w:tcW w:type="dxa" w:w="1728"/>
+            <w:tcW w:type="dxa" w:w="960"/>
           </w:tcPr>
           <w:p>
             <w:r/>
@@ -1431,7 +2399,37 @@
         </w:tc>
         <w:tc>
           <w:tcPr>
-            <w:tcW w:type="dxa" w:w="1728"/>
+            <w:tcW w:type="dxa" w:w="960"/>
+          </w:tcPr>
+          <w:p>
+            <w:r/>
+            <w:r>
+              <w:rPr>
+                <w:b w:val="0"/>
+                <w:sz w:val="18"/>
+              </w:rPr>
+              <w:t>0.81</w:t>
+            </w:r>
+          </w:p>
+        </w:tc>
+        <w:tc>
+          <w:tcPr>
+            <w:tcW w:type="dxa" w:w="960"/>
+          </w:tcPr>
+          <w:p>
+            <w:r/>
+            <w:r>
+              <w:rPr>
+                <w:b w:val="0"/>
+                <w:sz w:val="18"/>
+              </w:rPr>
+              <w:t>0.94</w:t>
+            </w:r>
+          </w:p>
+        </w:tc>
+        <w:tc>
+          <w:tcPr>
+            <w:tcW w:type="dxa" w:w="960"/>
           </w:tcPr>
           <w:p>
             <w:r/>
@@ -1446,7 +2444,37 @@
         </w:tc>
         <w:tc>
           <w:tcPr>
-            <w:tcW w:type="dxa" w:w="1728"/>
+            <w:tcW w:type="dxa" w:w="960"/>
+          </w:tcPr>
+          <w:p>
+            <w:r/>
+            <w:r>
+              <w:rPr>
+                <w:b w:val="0"/>
+                <w:sz w:val="18"/>
+              </w:rPr>
+              <w:t>0.85</w:t>
+            </w:r>
+          </w:p>
+        </w:tc>
+        <w:tc>
+          <w:tcPr>
+            <w:tcW w:type="dxa" w:w="960"/>
+          </w:tcPr>
+          <w:p>
+            <w:r/>
+            <w:r>
+              <w:rPr>
+                <w:b w:val="0"/>
+                <w:sz w:val="18"/>
+              </w:rPr>
+              <w:t>0.88</w:t>
+            </w:r>
+          </w:p>
+        </w:tc>
+        <w:tc>
+          <w:tcPr>
+            <w:tcW w:type="dxa" w:w="960"/>
           </w:tcPr>
           <w:p>
             <w:r/>
@@ -1461,7 +2489,7 @@
         </w:tc>
         <w:tc>
           <w:tcPr>
-            <w:tcW w:type="dxa" w:w="1728"/>
+            <w:tcW w:type="dxa" w:w="960"/>
           </w:tcPr>
           <w:p>
             <w:r/>
@@ -1478,7 +2506,7 @@
       <w:tr>
         <w:tc>
           <w:tcPr>
-            <w:tcW w:type="dxa" w:w="1728"/>
+            <w:tcW w:type="dxa" w:w="960"/>
           </w:tcPr>
           <w:p>
             <w:r/>
@@ -1493,7 +2521,7 @@
         </w:tc>
         <w:tc>
           <w:tcPr>
-            <w:tcW w:type="dxa" w:w="1728"/>
+            <w:tcW w:type="dxa" w:w="960"/>
           </w:tcPr>
           <w:p>
             <w:r/>
@@ -1508,7 +2536,22 @@
         </w:tc>
         <w:tc>
           <w:tcPr>
-            <w:tcW w:type="dxa" w:w="1728"/>
+            <w:tcW w:type="dxa" w:w="960"/>
+          </w:tcPr>
+          <w:p>
+            <w:r/>
+            <w:r>
+              <w:rPr>
+                <w:b w:val="0"/>
+                <w:sz w:val="18"/>
+              </w:rPr>
+              <w:t>0.77</w:t>
+            </w:r>
+          </w:p>
+        </w:tc>
+        <w:tc>
+          <w:tcPr>
+            <w:tcW w:type="dxa" w:w="960"/>
           </w:tcPr>
           <w:p>
             <w:r/>
@@ -1523,7 +2566,7 @@
         </w:tc>
         <w:tc>
           <w:tcPr>
-            <w:tcW w:type="dxa" w:w="1728"/>
+            <w:tcW w:type="dxa" w:w="960"/>
           </w:tcPr>
           <w:p>
             <w:r/>
@@ -1538,7 +2581,52 @@
         </w:tc>
         <w:tc>
           <w:tcPr>
-            <w:tcW w:type="dxa" w:w="1728"/>
+            <w:tcW w:type="dxa" w:w="960"/>
+          </w:tcPr>
+          <w:p>
+            <w:r/>
+            <w:r>
+              <w:rPr>
+                <w:b w:val="0"/>
+                <w:sz w:val="18"/>
+              </w:rPr>
+              <w:t>0.78</w:t>
+            </w:r>
+          </w:p>
+        </w:tc>
+        <w:tc>
+          <w:tcPr>
+            <w:tcW w:type="dxa" w:w="960"/>
+          </w:tcPr>
+          <w:p>
+            <w:r/>
+            <w:r>
+              <w:rPr>
+                <w:b w:val="0"/>
+                <w:sz w:val="18"/>
+              </w:rPr>
+              <w:t>0.80</w:t>
+            </w:r>
+          </w:p>
+        </w:tc>
+        <w:tc>
+          <w:tcPr>
+            <w:tcW w:type="dxa" w:w="960"/>
+          </w:tcPr>
+          <w:p>
+            <w:r/>
+            <w:r>
+              <w:rPr>
+                <w:b w:val="0"/>
+                <w:sz w:val="18"/>
+              </w:rPr>
+              <w:t>0.78</w:t>
+            </w:r>
+          </w:p>
+        </w:tc>
+        <w:tc>
+          <w:tcPr>
+            <w:tcW w:type="dxa" w:w="960"/>
           </w:tcPr>
           <w:p>
             <w:r/>
@@ -1555,7 +2643,7 @@
       <w:tr>
         <w:tc>
           <w:tcPr>
-            <w:tcW w:type="dxa" w:w="1728"/>
+            <w:tcW w:type="dxa" w:w="960"/>
           </w:tcPr>
           <w:p>
             <w:r/>
@@ -1570,7 +2658,7 @@
         </w:tc>
         <w:tc>
           <w:tcPr>
-            <w:tcW w:type="dxa" w:w="1728"/>
+            <w:tcW w:type="dxa" w:w="960"/>
           </w:tcPr>
           <w:p>
             <w:r/>
@@ -1585,7 +2673,37 @@
         </w:tc>
         <w:tc>
           <w:tcPr>
-            <w:tcW w:type="dxa" w:w="1728"/>
+            <w:tcW w:type="dxa" w:w="960"/>
+          </w:tcPr>
+          <w:p>
+            <w:r/>
+            <w:r>
+              <w:rPr>
+                <w:b w:val="0"/>
+                <w:sz w:val="18"/>
+              </w:rPr>
+              <w:t>0.95</w:t>
+            </w:r>
+          </w:p>
+        </w:tc>
+        <w:tc>
+          <w:tcPr>
+            <w:tcW w:type="dxa" w:w="960"/>
+          </w:tcPr>
+          <w:p>
+            <w:r/>
+            <w:r>
+              <w:rPr>
+                <w:b w:val="0"/>
+                <w:sz w:val="18"/>
+              </w:rPr>
+              <w:t>0.98</w:t>
+            </w:r>
+          </w:p>
+        </w:tc>
+        <w:tc>
+          <w:tcPr>
+            <w:tcW w:type="dxa" w:w="960"/>
           </w:tcPr>
           <w:p>
             <w:r/>
@@ -1600,7 +2718,37 @@
         </w:tc>
         <w:tc>
           <w:tcPr>
-            <w:tcW w:type="dxa" w:w="1728"/>
+            <w:tcW w:type="dxa" w:w="960"/>
+          </w:tcPr>
+          <w:p>
+            <w:r/>
+            <w:r>
+              <w:rPr>
+                <w:b w:val="0"/>
+                <w:sz w:val="18"/>
+              </w:rPr>
+              <w:t>0.94</w:t>
+            </w:r>
+          </w:p>
+        </w:tc>
+        <w:tc>
+          <w:tcPr>
+            <w:tcW w:type="dxa" w:w="960"/>
+          </w:tcPr>
+          <w:p>
+            <w:r/>
+            <w:r>
+              <w:rPr>
+                <w:b w:val="0"/>
+                <w:sz w:val="18"/>
+              </w:rPr>
+              <w:t>0.93</w:t>
+            </w:r>
+          </w:p>
+        </w:tc>
+        <w:tc>
+          <w:tcPr>
+            <w:tcW w:type="dxa" w:w="960"/>
           </w:tcPr>
           <w:p>
             <w:r/>
@@ -1615,7 +2763,7 @@
         </w:tc>
         <w:tc>
           <w:tcPr>
-            <w:tcW w:type="dxa" w:w="1728"/>
+            <w:tcW w:type="dxa" w:w="960"/>
           </w:tcPr>
           <w:p>
             <w:r/>
@@ -1632,7 +2780,7 @@
       <w:tr>
         <w:tc>
           <w:tcPr>
-            <w:tcW w:type="dxa" w:w="1728"/>
+            <w:tcW w:type="dxa" w:w="960"/>
           </w:tcPr>
           <w:p>
             <w:r/>
@@ -1647,7 +2795,7 @@
         </w:tc>
         <w:tc>
           <w:tcPr>
-            <w:tcW w:type="dxa" w:w="1728"/>
+            <w:tcW w:type="dxa" w:w="960"/>
           </w:tcPr>
           <w:p>
             <w:r/>
@@ -1662,7 +2810,37 @@
         </w:tc>
         <w:tc>
           <w:tcPr>
-            <w:tcW w:type="dxa" w:w="1728"/>
+            <w:tcW w:type="dxa" w:w="960"/>
+          </w:tcPr>
+          <w:p>
+            <w:r/>
+            <w:r>
+              <w:rPr>
+                <w:b w:val="0"/>
+                <w:sz w:val="18"/>
+              </w:rPr>
+              <w:t>0.97</w:t>
+            </w:r>
+          </w:p>
+        </w:tc>
+        <w:tc>
+          <w:tcPr>
+            <w:tcW w:type="dxa" w:w="960"/>
+          </w:tcPr>
+          <w:p>
+            <w:r/>
+            <w:r>
+              <w:rPr>
+                <w:b w:val="0"/>
+                <w:sz w:val="18"/>
+              </w:rPr>
+              <w:t>0.99</w:t>
+            </w:r>
+          </w:p>
+        </w:tc>
+        <w:tc>
+          <w:tcPr>
+            <w:tcW w:type="dxa" w:w="960"/>
           </w:tcPr>
           <w:p>
             <w:r/>
@@ -1677,7 +2855,37 @@
         </w:tc>
         <w:tc>
           <w:tcPr>
-            <w:tcW w:type="dxa" w:w="1728"/>
+            <w:tcW w:type="dxa" w:w="960"/>
+          </w:tcPr>
+          <w:p>
+            <w:r/>
+            <w:r>
+              <w:rPr>
+                <w:b w:val="0"/>
+                <w:sz w:val="18"/>
+              </w:rPr>
+              <w:t>0.97</w:t>
+            </w:r>
+          </w:p>
+        </w:tc>
+        <w:tc>
+          <w:tcPr>
+            <w:tcW w:type="dxa" w:w="960"/>
+          </w:tcPr>
+          <w:p>
+            <w:r/>
+            <w:r>
+              <w:rPr>
+                <w:b w:val="0"/>
+                <w:sz w:val="18"/>
+              </w:rPr>
+              <w:t>0.98</w:t>
+            </w:r>
+          </w:p>
+        </w:tc>
+        <w:tc>
+          <w:tcPr>
+            <w:tcW w:type="dxa" w:w="960"/>
           </w:tcPr>
           <w:p>
             <w:r/>
@@ -1692,7 +2900,7 @@
         </w:tc>
         <w:tc>
           <w:tcPr>
-            <w:tcW w:type="dxa" w:w="1728"/>
+            <w:tcW w:type="dxa" w:w="960"/>
           </w:tcPr>
           <w:p>
             <w:r/>
@@ -1709,7 +2917,7 @@
       <w:tr>
         <w:tc>
           <w:tcPr>
-            <w:tcW w:type="dxa" w:w="1728"/>
+            <w:tcW w:type="dxa" w:w="960"/>
           </w:tcPr>
           <w:p>
             <w:r/>
@@ -1724,7 +2932,7 @@
         </w:tc>
         <w:tc>
           <w:tcPr>
-            <w:tcW w:type="dxa" w:w="1728"/>
+            <w:tcW w:type="dxa" w:w="960"/>
           </w:tcPr>
           <w:p>
             <w:r/>
@@ -1739,7 +2947,37 @@
         </w:tc>
         <w:tc>
           <w:tcPr>
-            <w:tcW w:type="dxa" w:w="1728"/>
+            <w:tcW w:type="dxa" w:w="960"/>
+          </w:tcPr>
+          <w:p>
+            <w:r/>
+            <w:r>
+              <w:rPr>
+                <w:b w:val="0"/>
+                <w:sz w:val="18"/>
+              </w:rPr>
+              <w:t>0.53</w:t>
+            </w:r>
+          </w:p>
+        </w:tc>
+        <w:tc>
+          <w:tcPr>
+            <w:tcW w:type="dxa" w:w="960"/>
+          </w:tcPr>
+          <w:p>
+            <w:r/>
+            <w:r>
+              <w:rPr>
+                <w:b w:val="0"/>
+                <w:sz w:val="18"/>
+              </w:rPr>
+              <w:t>0.47</w:t>
+            </w:r>
+          </w:p>
+        </w:tc>
+        <w:tc>
+          <w:tcPr>
+            <w:tcW w:type="dxa" w:w="960"/>
           </w:tcPr>
           <w:p>
             <w:r/>
@@ -1754,7 +2992,37 @@
         </w:tc>
         <w:tc>
           <w:tcPr>
-            <w:tcW w:type="dxa" w:w="1728"/>
+            <w:tcW w:type="dxa" w:w="960"/>
+          </w:tcPr>
+          <w:p>
+            <w:r/>
+            <w:r>
+              <w:rPr>
+                <w:b w:val="0"/>
+                <w:sz w:val="18"/>
+              </w:rPr>
+              <w:t>0.59</w:t>
+            </w:r>
+          </w:p>
+        </w:tc>
+        <w:tc>
+          <w:tcPr>
+            <w:tcW w:type="dxa" w:w="960"/>
+          </w:tcPr>
+          <w:p>
+            <w:r/>
+            <w:r>
+              <w:rPr>
+                <w:b w:val="0"/>
+                <w:sz w:val="18"/>
+              </w:rPr>
+              <w:t>0.45</w:t>
+            </w:r>
+          </w:p>
+        </w:tc>
+        <w:tc>
+          <w:tcPr>
+            <w:tcW w:type="dxa" w:w="960"/>
           </w:tcPr>
           <w:p>
             <w:r/>
@@ -1769,7 +3037,7 @@
         </w:tc>
         <w:tc>
           <w:tcPr>
-            <w:tcW w:type="dxa" w:w="1728"/>
+            <w:tcW w:type="dxa" w:w="960"/>
           </w:tcPr>
           <w:p>
             <w:r/>
@@ -1786,7 +3054,7 @@
       <w:tr>
         <w:tc>
           <w:tcPr>
-            <w:tcW w:type="dxa" w:w="1728"/>
+            <w:tcW w:type="dxa" w:w="960"/>
           </w:tcPr>
           <w:p>
             <w:r/>
@@ -1801,7 +3069,7 @@
         </w:tc>
         <w:tc>
           <w:tcPr>
-            <w:tcW w:type="dxa" w:w="1728"/>
+            <w:tcW w:type="dxa" w:w="960"/>
           </w:tcPr>
           <w:p>
             <w:r/>
@@ -1816,7 +3084,22 @@
         </w:tc>
         <w:tc>
           <w:tcPr>
-            <w:tcW w:type="dxa" w:w="1728"/>
+            <w:tcW w:type="dxa" w:w="960"/>
+          </w:tcPr>
+          <w:p>
+            <w:r/>
+            <w:r>
+              <w:rPr>
+                <w:b w:val="0"/>
+                <w:sz w:val="18"/>
+              </w:rPr>
+              <w:t>0.86</w:t>
+            </w:r>
+          </w:p>
+        </w:tc>
+        <w:tc>
+          <w:tcPr>
+            <w:tcW w:type="dxa" w:w="960"/>
           </w:tcPr>
           <w:p>
             <w:r/>
@@ -1831,7 +3114,52 @@
         </w:tc>
         <w:tc>
           <w:tcPr>
-            <w:tcW w:type="dxa" w:w="1728"/>
+            <w:tcW w:type="dxa" w:w="960"/>
+          </w:tcPr>
+          <w:p>
+            <w:r/>
+            <w:r>
+              <w:rPr>
+                <w:b w:val="0"/>
+                <w:sz w:val="18"/>
+              </w:rPr>
+              <w:t>0.82</w:t>
+            </w:r>
+          </w:p>
+        </w:tc>
+        <w:tc>
+          <w:tcPr>
+            <w:tcW w:type="dxa" w:w="960"/>
+          </w:tcPr>
+          <w:p>
+            <w:r/>
+            <w:r>
+              <w:rPr>
+                <w:b w:val="0"/>
+                <w:sz w:val="18"/>
+              </w:rPr>
+              <w:t>0.82</w:t>
+            </w:r>
+          </w:p>
+        </w:tc>
+        <w:tc>
+          <w:tcPr>
+            <w:tcW w:type="dxa" w:w="960"/>
+          </w:tcPr>
+          <w:p>
+            <w:r/>
+            <w:r>
+              <w:rPr>
+                <w:b w:val="0"/>
+                <w:sz w:val="18"/>
+              </w:rPr>
+              <w:t>0.90</w:t>
+            </w:r>
+          </w:p>
+        </w:tc>
+        <w:tc>
+          <w:tcPr>
+            <w:tcW w:type="dxa" w:w="960"/>
           </w:tcPr>
           <w:p>
             <w:r/>
@@ -1846,7 +3174,7 @@
         </w:tc>
         <w:tc>
           <w:tcPr>
-            <w:tcW w:type="dxa" w:w="1728"/>
+            <w:tcW w:type="dxa" w:w="960"/>
           </w:tcPr>
           <w:p>
             <w:r/>
@@ -1863,7 +3191,7 @@
       <w:tr>
         <w:tc>
           <w:tcPr>
-            <w:tcW w:type="dxa" w:w="1728"/>
+            <w:tcW w:type="dxa" w:w="960"/>
           </w:tcPr>
           <w:p>
             <w:r/>
@@ -1878,7 +3206,7 @@
         </w:tc>
         <w:tc>
           <w:tcPr>
-            <w:tcW w:type="dxa" w:w="1728"/>
+            <w:tcW w:type="dxa" w:w="960"/>
           </w:tcPr>
           <w:p>
             <w:r/>
@@ -1893,7 +3221,7 @@
         </w:tc>
         <w:tc>
           <w:tcPr>
-            <w:tcW w:type="dxa" w:w="1728"/>
+            <w:tcW w:type="dxa" w:w="960"/>
           </w:tcPr>
           <w:p>
             <w:r/>
@@ -1908,7 +3236,7 @@
         </w:tc>
         <w:tc>
           <w:tcPr>
-            <w:tcW w:type="dxa" w:w="1728"/>
+            <w:tcW w:type="dxa" w:w="960"/>
           </w:tcPr>
           <w:p>
             <w:r/>
@@ -1923,7 +3251,67 @@
         </w:tc>
         <w:tc>
           <w:tcPr>
-            <w:tcW w:type="dxa" w:w="1728"/>
+            <w:tcW w:type="dxa" w:w="960"/>
+          </w:tcPr>
+          <w:p>
+            <w:r/>
+            <w:r>
+              <w:rPr>
+                <w:b w:val="0"/>
+                <w:sz w:val="18"/>
+              </w:rPr>
+              <w:t>1.00</w:t>
+            </w:r>
+          </w:p>
+        </w:tc>
+        <w:tc>
+          <w:tcPr>
+            <w:tcW w:type="dxa" w:w="960"/>
+          </w:tcPr>
+          <w:p>
+            <w:r/>
+            <w:r>
+              <w:rPr>
+                <w:b w:val="0"/>
+                <w:sz w:val="18"/>
+              </w:rPr>
+              <w:t>1.00</w:t>
+            </w:r>
+          </w:p>
+        </w:tc>
+        <w:tc>
+          <w:tcPr>
+            <w:tcW w:type="dxa" w:w="960"/>
+          </w:tcPr>
+          <w:p>
+            <w:r/>
+            <w:r>
+              <w:rPr>
+                <w:b w:val="0"/>
+                <w:sz w:val="18"/>
+              </w:rPr>
+              <w:t>1.00</w:t>
+            </w:r>
+          </w:p>
+        </w:tc>
+        <w:tc>
+          <w:tcPr>
+            <w:tcW w:type="dxa" w:w="960"/>
+          </w:tcPr>
+          <w:p>
+            <w:r/>
+            <w:r>
+              <w:rPr>
+                <w:b w:val="0"/>
+                <w:sz w:val="18"/>
+              </w:rPr>
+              <w:t>1.00</w:t>
+            </w:r>
+          </w:p>
+        </w:tc>
+        <w:tc>
+          <w:tcPr>
+            <w:tcW w:type="dxa" w:w="960"/>
           </w:tcPr>
           <w:p>
             <w:r/>
@@ -2099,6 +3487,100 @@
                 <w:b w:val="0"/>
                 <w:sz w:val="18"/>
               </w:rPr>
+              <w:t>CATBOOST</w:t>
+            </w:r>
+          </w:p>
+        </w:tc>
+        <w:tc>
+          <w:tcPr>
+            <w:tcW w:type="dxa" w:w="2880"/>
+          </w:tcPr>
+          <w:p>
+            <w:r/>
+            <w:r>
+              <w:rPr>
+                <w:b w:val="0"/>
+                <w:sz w:val="18"/>
+              </w:rPr>
+              <w:t>0.997</w:t>
+            </w:r>
+          </w:p>
+        </w:tc>
+        <w:tc>
+          <w:tcPr>
+            <w:tcW w:type="dxa" w:w="2880"/>
+          </w:tcPr>
+          <w:p>
+            <w:r/>
+            <w:r>
+              <w:rPr>
+                <w:b w:val="0"/>
+                <w:sz w:val="18"/>
+              </w:rPr>
+              <w:t>1.0</w:t>
+            </w:r>
+          </w:p>
+        </w:tc>
+      </w:tr>
+      <w:tr>
+        <w:tc>
+          <w:tcPr>
+            <w:tcW w:type="dxa" w:w="2880"/>
+          </w:tcPr>
+          <w:p>
+            <w:r/>
+            <w:r>
+              <w:rPr>
+                <w:b w:val="0"/>
+                <w:sz w:val="18"/>
+              </w:rPr>
+              <w:t>HGB</w:t>
+            </w:r>
+          </w:p>
+        </w:tc>
+        <w:tc>
+          <w:tcPr>
+            <w:tcW w:type="dxa" w:w="2880"/>
+          </w:tcPr>
+          <w:p>
+            <w:r/>
+            <w:r>
+              <w:rPr>
+                <w:b w:val="0"/>
+                <w:sz w:val="18"/>
+              </w:rPr>
+              <w:t>0.94</w:t>
+            </w:r>
+          </w:p>
+        </w:tc>
+        <w:tc>
+          <w:tcPr>
+            <w:tcW w:type="dxa" w:w="2880"/>
+          </w:tcPr>
+          <w:p>
+            <w:r/>
+            <w:r>
+              <w:rPr>
+                <w:b w:val="0"/>
+                <w:sz w:val="18"/>
+              </w:rPr>
+              <w:t>1.0</w:t>
+            </w:r>
+          </w:p>
+        </w:tc>
+      </w:tr>
+      <w:tr>
+        <w:tc>
+          <w:tcPr>
+            <w:tcW w:type="dxa" w:w="2880"/>
+          </w:tcPr>
+          <w:p>
+            <w:r/>
+            <w:r>
+              <w:rPr>
+                <w:b w:val="0"/>
+                <w:sz w:val="18"/>
+              </w:rPr>
               <w:t>RF</w:t>
             </w:r>
           </w:p>
@@ -2130,6 +3612,100 @@
                 <w:sz w:val="18"/>
               </w:rPr>
               <w:t>0.9</w:t>
+            </w:r>
+          </w:p>
+        </w:tc>
+      </w:tr>
+      <w:tr>
+        <w:tc>
+          <w:tcPr>
+            <w:tcW w:type="dxa" w:w="2880"/>
+          </w:tcPr>
+          <w:p>
+            <w:r/>
+            <w:r>
+              <w:rPr>
+                <w:b w:val="0"/>
+                <w:sz w:val="18"/>
+              </w:rPr>
+              <w:t>ET</w:t>
+            </w:r>
+          </w:p>
+        </w:tc>
+        <w:tc>
+          <w:tcPr>
+            <w:tcW w:type="dxa" w:w="2880"/>
+          </w:tcPr>
+          <w:p>
+            <w:r/>
+            <w:r>
+              <w:rPr>
+                <w:b w:val="0"/>
+                <w:sz w:val="18"/>
+              </w:rPr>
+              <w:t>0.994</w:t>
+            </w:r>
+          </w:p>
+        </w:tc>
+        <w:tc>
+          <w:tcPr>
+            <w:tcW w:type="dxa" w:w="2880"/>
+          </w:tcPr>
+          <w:p>
+            <w:r/>
+            <w:r>
+              <w:rPr>
+                <w:b w:val="0"/>
+                <w:sz w:val="18"/>
+              </w:rPr>
+              <w:t>0.95</w:t>
+            </w:r>
+          </w:p>
+        </w:tc>
+      </w:tr>
+      <w:tr>
+        <w:tc>
+          <w:tcPr>
+            <w:tcW w:type="dxa" w:w="2880"/>
+          </w:tcPr>
+          <w:p>
+            <w:r/>
+            <w:r>
+              <w:rPr>
+                <w:b w:val="0"/>
+                <w:sz w:val="18"/>
+              </w:rPr>
+              <w:t>SVM</w:t>
+            </w:r>
+          </w:p>
+        </w:tc>
+        <w:tc>
+          <w:tcPr>
+            <w:tcW w:type="dxa" w:w="2880"/>
+          </w:tcPr>
+          <w:p>
+            <w:r/>
+            <w:r>
+              <w:rPr>
+                <w:b w:val="0"/>
+                <w:sz w:val="18"/>
+              </w:rPr>
+              <w:t>0.825</w:t>
+            </w:r>
+          </w:p>
+        </w:tc>
+        <w:tc>
+          <w:tcPr>
+            <w:tcW w:type="dxa" w:w="2880"/>
+          </w:tcPr>
+          <w:p>
+            <w:r/>
+            <w:r>
+              <w:rPr>
+                <w:b w:val="0"/>
+                <w:sz w:val="18"/>
+              </w:rPr>
+              <w:t>0.817</w:t>
             </w:r>
           </w:p>
         </w:tc>
@@ -5404,6 +6980,11 @@
     <w:p>
       <w:r>
         <w:t>Locked classifier: MLP, features 'both' (189-d), seed 0 (classifier/models/mlp.joblib). Accuracy is tied with LightGBM inside 5-seed noise (real-eval 0.857 ± 0.016 vs 0.866); MLP wins on the deployment axes — 0.3 MB vs 31 MB, and a confidence gap (0.85 correct / 0.49 wrong) wide enough to drive the Phase 5 idle threshold without a separate calibration step.</w:t>
+      </w:r>
+    </w:p>
+    <w:p>
+      <w:r>
+        <w:t>All 8 candidates were trained and scored (section 1), including CatBoost, HistGradientBoosting, RBF-SVM and ExtraTrees — the four an earlier session had left unrun. They do not change the pick: the GBDT family does not cluster around LightGBM as had been assumed (CatBoost −8, HGB −5.5 real-eval points at the screening configs), and none of the four beats LightGBM or MLP on any axis that matters. HGB is the best-calibrated model of the lot (ECE 0.022) but trails MLP on both accuracy and confidence spread.</w:t>
       </w:r>
     </w:p>
     <w:p>

</xml_diff>

<commit_message>
Phase 4 report: expand to a standalone detailed version
scripts/phase4_report.py:
 - 0. Dataset & setup — feature-vector breakdown, split provenance (by
   subject, external train / our-footage test), full AugParams, per-class
   train/val/test counts + eval-type legend
 - 4. adds the locked model's top-8 confusion pairs + a read of the error
   pattern (recall loss to idle, not cross-gesture mix-ups), plus the
   runner-up LightGBM confusion matrix for comparison
 - 4b. adds the SE gate's per-class feature-block table (right-hand block
   0.72 vs left 0.56 for raise_right, mirror for raise_left, postures lean
   on joint angles) — the interpretability evidence, was prose only
 - 9. Handoff to Phase 5/6 — per-frame classifier + majority vote, the
   0.20 global floor only, which classes Phase 6 field data gates, the
   feature question to re-open

Regenerated from current data (9 candidates incl. SE-MLP). baseline doc
gate numbers updated to the committed floor-0.5 model.
</commit_message>
<xml_diff>
--- a/results/phase4/classifier_report.docx
+++ b/results/phase4/classifier_report.docx
@@ -30,7 +30,1060 @@
     </w:p>
     <w:p>
       <w:r>
-        <w:t>Sections 1–4: the model-family comparison (Track C). Sections 5–7: the feature-set (B), augmentation-strength (D) and confidence-threshold (E) sweeps done on the locked model. Section 8: verdict.</w:t>
+        <w:t>Section 0: dataset &amp; setup. Sections 1–4b: the model-family comparison (Track C) + the SE-MLP follow-up. Sections 5–7: the feature-set (B), augmentation-strength (D) and confidence-threshold (E) sweeps on the locked model. Section 8: verdict. Section 9: Phase 5/6 handoff.</w:t>
+      </w:r>
+    </w:p>
+    <w:p>
+      <w:pPr>
+        <w:pStyle w:val="Heading1"/>
+      </w:pPr>
+      <w:r>
+        <w:t>0. Dataset &amp; setup</w:t>
+      </w:r>
+    </w:p>
+    <w:p>
+      <w:r>
+        <w:t>Feature vector: 152-d raw (body 33×2 + left hand 21×2 + presence flag + right hand 21×2 + presence flag) plus 37 scale-invariant derived features (8 body joint angles, torso lean, wrist heights, shoulder tilt, inter-wrist distance, per-hand finger curls / spreads / tip-distance ratios) = 189-d 'both'. Definitions in features/schema.py + features/derived.py.</w:t>
+      </w:r>
+    </w:p>
+    <w:p>
+      <w:r>
+        <w:t>Split (by subject / recording session, never by frame — CLAUDE.md #5): TRAIN 52,738 rows = external public datasets (HaGRID, COCO, Roboflow), cleaned + augmented. VAL 2,357 = 15 % of each external class's clean pre-augment rows (same domain, never augmented). TEST 1,254 = every original s01/s02 frame — a genuine cross-domain / cross-subject hold-out (+ held-out HaGRID subjects for thumb, which has no s01/s02 clip).</w:t>
+      </w:r>
+    </w:p>
+    <w:p>
+      <w:r>
+        <w:t>Augmentation (train only): mirror p=0.5 with L/R label + slice swap, ±12.0° rotation, 0.05 keypoint dropout, 0.1 whole-hand drop, 0.02 coord noise, ±0.15 limb-length jitter, 4 copies/sample; mini_heart also gets an arm-elevation pass. features/augment.py.</w:t>
+      </w:r>
+    </w:p>
+    <w:tbl>
+      <w:tblPr>
+        <w:tblStyle w:val="LightGrid-Accent1"/>
+        <w:tblW w:type="auto" w:w="0"/>
+        <w:tblLook w:firstColumn="1" w:firstRow="1" w:lastColumn="0" w:lastRow="0" w:noHBand="0" w:noVBand="1" w:val="04A0"/>
+      </w:tblPr>
+      <w:tblGrid>
+        <w:gridCol w:w="1728"/>
+        <w:gridCol w:w="1728"/>
+        <w:gridCol w:w="1728"/>
+        <w:gridCol w:w="1728"/>
+        <w:gridCol w:w="1728"/>
+      </w:tblGrid>
+      <w:tr>
+        <w:tc>
+          <w:tcPr>
+            <w:tcW w:type="dxa" w:w="1728"/>
+          </w:tcPr>
+          <w:p>
+            <w:r/>
+            <w:r>
+              <w:rPr>
+                <w:b/>
+                <w:sz w:val="18"/>
+              </w:rPr>
+              <w:t>class</w:t>
+            </w:r>
+          </w:p>
+        </w:tc>
+        <w:tc>
+          <w:tcPr>
+            <w:tcW w:type="dxa" w:w="1728"/>
+          </w:tcPr>
+          <w:p>
+            <w:r/>
+            <w:r>
+              <w:rPr>
+                <w:b/>
+                <w:sz w:val="18"/>
+              </w:rPr>
+              <w:t>eval type</w:t>
+            </w:r>
+          </w:p>
+        </w:tc>
+        <w:tc>
+          <w:tcPr>
+            <w:tcW w:type="dxa" w:w="1728"/>
+          </w:tcPr>
+          <w:p>
+            <w:r/>
+            <w:r>
+              <w:rPr>
+                <w:b/>
+                <w:sz w:val="18"/>
+              </w:rPr>
+              <w:t>train</w:t>
+            </w:r>
+          </w:p>
+        </w:tc>
+        <w:tc>
+          <w:tcPr>
+            <w:tcW w:type="dxa" w:w="1728"/>
+          </w:tcPr>
+          <w:p>
+            <w:r/>
+            <w:r>
+              <w:rPr>
+                <w:b/>
+                <w:sz w:val="18"/>
+              </w:rPr>
+              <w:t>val</w:t>
+            </w:r>
+          </w:p>
+        </w:tc>
+        <w:tc>
+          <w:tcPr>
+            <w:tcW w:type="dxa" w:w="1728"/>
+          </w:tcPr>
+          <w:p>
+            <w:r/>
+            <w:r>
+              <w:rPr>
+                <w:b/>
+                <w:sz w:val="18"/>
+              </w:rPr>
+              <w:t>test</w:t>
+            </w:r>
+          </w:p>
+        </w:tc>
+      </w:tr>
+      <w:tr>
+        <w:tc>
+          <w:tcPr>
+            <w:tcW w:type="dxa" w:w="1728"/>
+          </w:tcPr>
+          <w:p>
+            <w:r/>
+            <w:r>
+              <w:rPr>
+                <w:b w:val="0"/>
+                <w:sz w:val="18"/>
+              </w:rPr>
+              <w:t>idle</w:t>
+            </w:r>
+          </w:p>
+        </w:tc>
+        <w:tc>
+          <w:tcPr>
+            <w:tcW w:type="dxa" w:w="1728"/>
+          </w:tcPr>
+          <w:p>
+            <w:r/>
+            <w:r>
+              <w:rPr>
+                <w:b w:val="0"/>
+                <w:sz w:val="18"/>
+              </w:rPr>
+              <w:t>cross_domain</w:t>
+            </w:r>
+          </w:p>
+        </w:tc>
+        <w:tc>
+          <w:tcPr>
+            <w:tcW w:type="dxa" w:w="1728"/>
+          </w:tcPr>
+          <w:p>
+            <w:r/>
+            <w:r>
+              <w:rPr>
+                <w:b w:val="0"/>
+                <w:sz w:val="18"/>
+              </w:rPr>
+              <w:t>7,000</w:t>
+            </w:r>
+          </w:p>
+        </w:tc>
+        <w:tc>
+          <w:tcPr>
+            <w:tcW w:type="dxa" w:w="1728"/>
+          </w:tcPr>
+          <w:p>
+            <w:r/>
+            <w:r>
+              <w:rPr>
+                <w:b w:val="0"/>
+                <w:sz w:val="18"/>
+              </w:rPr>
+              <w:t>898</w:t>
+            </w:r>
+          </w:p>
+        </w:tc>
+        <w:tc>
+          <w:tcPr>
+            <w:tcW w:type="dxa" w:w="1728"/>
+          </w:tcPr>
+          <w:p>
+            <w:r/>
+            <w:r>
+              <w:rPr>
+                <w:b w:val="0"/>
+                <w:sz w:val="18"/>
+              </w:rPr>
+              <w:t>60</w:t>
+            </w:r>
+          </w:p>
+        </w:tc>
+      </w:tr>
+      <w:tr>
+        <w:tc>
+          <w:tcPr>
+            <w:tcW w:type="dxa" w:w="1728"/>
+          </w:tcPr>
+          <w:p>
+            <w:r/>
+            <w:r>
+              <w:rPr>
+                <w:b w:val="0"/>
+                <w:sz w:val="18"/>
+              </w:rPr>
+              <w:t>raise_right_hand</w:t>
+            </w:r>
+          </w:p>
+        </w:tc>
+        <w:tc>
+          <w:tcPr>
+            <w:tcW w:type="dxa" w:w="1728"/>
+          </w:tcPr>
+          <w:p>
+            <w:r/>
+            <w:r>
+              <w:rPr>
+                <w:b w:val="0"/>
+                <w:sz w:val="18"/>
+              </w:rPr>
+              <w:t>cross_domain</w:t>
+            </w:r>
+          </w:p>
+        </w:tc>
+        <w:tc>
+          <w:tcPr>
+            <w:tcW w:type="dxa" w:w="1728"/>
+          </w:tcPr>
+          <w:p>
+            <w:r/>
+            <w:r>
+              <w:rPr>
+                <w:b w:val="0"/>
+                <w:sz w:val="18"/>
+              </w:rPr>
+              <w:t>2,982</w:t>
+            </w:r>
+          </w:p>
+        </w:tc>
+        <w:tc>
+          <w:tcPr>
+            <w:tcW w:type="dxa" w:w="1728"/>
+          </w:tcPr>
+          <w:p>
+            <w:r/>
+            <w:r>
+              <w:rPr>
+                <w:b w:val="0"/>
+                <w:sz w:val="18"/>
+              </w:rPr>
+              <w:t>87</w:t>
+            </w:r>
+          </w:p>
+        </w:tc>
+        <w:tc>
+          <w:tcPr>
+            <w:tcW w:type="dxa" w:w="1728"/>
+          </w:tcPr>
+          <w:p>
+            <w:r/>
+            <w:r>
+              <w:rPr>
+                <w:b w:val="0"/>
+                <w:sz w:val="18"/>
+              </w:rPr>
+              <w:t>96</w:t>
+            </w:r>
+          </w:p>
+        </w:tc>
+      </w:tr>
+      <w:tr>
+        <w:tc>
+          <w:tcPr>
+            <w:tcW w:type="dxa" w:w="1728"/>
+          </w:tcPr>
+          <w:p>
+            <w:r/>
+            <w:r>
+              <w:rPr>
+                <w:b w:val="0"/>
+                <w:sz w:val="18"/>
+              </w:rPr>
+              <w:t>raise_left_hand</w:t>
+            </w:r>
+          </w:p>
+        </w:tc>
+        <w:tc>
+          <w:tcPr>
+            <w:tcW w:type="dxa" w:w="1728"/>
+          </w:tcPr>
+          <w:p>
+            <w:r/>
+            <w:r>
+              <w:rPr>
+                <w:b w:val="0"/>
+                <w:sz w:val="18"/>
+              </w:rPr>
+              <w:t>cross_domain</w:t>
+            </w:r>
+          </w:p>
+        </w:tc>
+        <w:tc>
+          <w:tcPr>
+            <w:tcW w:type="dxa" w:w="1728"/>
+          </w:tcPr>
+          <w:p>
+            <w:r/>
+            <w:r>
+              <w:rPr>
+                <w:b w:val="0"/>
+                <w:sz w:val="18"/>
+              </w:rPr>
+              <w:t>2,779</w:t>
+            </w:r>
+          </w:p>
+        </w:tc>
+        <w:tc>
+          <w:tcPr>
+            <w:tcW w:type="dxa" w:w="1728"/>
+          </w:tcPr>
+          <w:p>
+            <w:r/>
+            <w:r>
+              <w:rPr>
+                <w:b w:val="0"/>
+                <w:sz w:val="18"/>
+              </w:rPr>
+              <w:t>70</w:t>
+            </w:r>
+          </w:p>
+        </w:tc>
+        <w:tc>
+          <w:tcPr>
+            <w:tcW w:type="dxa" w:w="1728"/>
+          </w:tcPr>
+          <w:p>
+            <w:r/>
+            <w:r>
+              <w:rPr>
+                <w:b w:val="0"/>
+                <w:sz w:val="18"/>
+              </w:rPr>
+              <w:t>45</w:t>
+            </w:r>
+          </w:p>
+        </w:tc>
+      </w:tr>
+      <w:tr>
+        <w:tc>
+          <w:tcPr>
+            <w:tcW w:type="dxa" w:w="1728"/>
+          </w:tcPr>
+          <w:p>
+            <w:r/>
+            <w:r>
+              <w:rPr>
+                <w:b w:val="0"/>
+                <w:sz w:val="18"/>
+              </w:rPr>
+              <w:t>sit</w:t>
+            </w:r>
+          </w:p>
+        </w:tc>
+        <w:tc>
+          <w:tcPr>
+            <w:tcW w:type="dxa" w:w="1728"/>
+          </w:tcPr>
+          <w:p>
+            <w:r/>
+            <w:r>
+              <w:rPr>
+                <w:b w:val="0"/>
+                <w:sz w:val="18"/>
+              </w:rPr>
+              <w:t>cross_domain</w:t>
+            </w:r>
+          </w:p>
+        </w:tc>
+        <w:tc>
+          <w:tcPr>
+            <w:tcW w:type="dxa" w:w="1728"/>
+          </w:tcPr>
+          <w:p>
+            <w:r/>
+            <w:r>
+              <w:rPr>
+                <w:b w:val="0"/>
+                <w:sz w:val="18"/>
+              </w:rPr>
+              <w:t>5,835</w:t>
+            </w:r>
+          </w:p>
+        </w:tc>
+        <w:tc>
+          <w:tcPr>
+            <w:tcW w:type="dxa" w:w="1728"/>
+          </w:tcPr>
+          <w:p>
+            <w:r/>
+            <w:r>
+              <w:rPr>
+                <w:b w:val="0"/>
+                <w:sz w:val="18"/>
+              </w:rPr>
+              <w:t>205</w:t>
+            </w:r>
+          </w:p>
+        </w:tc>
+        <w:tc>
+          <w:tcPr>
+            <w:tcW w:type="dxa" w:w="1728"/>
+          </w:tcPr>
+          <w:p>
+            <w:r/>
+            <w:r>
+              <w:rPr>
+                <w:b w:val="0"/>
+                <w:sz w:val="18"/>
+              </w:rPr>
+              <w:t>375</w:t>
+            </w:r>
+          </w:p>
+        </w:tc>
+      </w:tr>
+      <w:tr>
+        <w:tc>
+          <w:tcPr>
+            <w:tcW w:type="dxa" w:w="1728"/>
+          </w:tcPr>
+          <w:p>
+            <w:r/>
+            <w:r>
+              <w:rPr>
+                <w:b w:val="0"/>
+                <w:color w:val="886600"/>
+                <w:sz w:val="18"/>
+              </w:rPr>
+              <w:t>squat</w:t>
+            </w:r>
+          </w:p>
+        </w:tc>
+        <w:tc>
+          <w:tcPr>
+            <w:tcW w:type="dxa" w:w="1728"/>
+          </w:tcPr>
+          <w:p>
+            <w:r/>
+            <w:r>
+              <w:rPr>
+                <w:b w:val="0"/>
+                <w:color w:val="886600"/>
+                <w:sz w:val="18"/>
+              </w:rPr>
+              <w:t>aug_only_leak</w:t>
+            </w:r>
+          </w:p>
+        </w:tc>
+        <w:tc>
+          <w:tcPr>
+            <w:tcW w:type="dxa" w:w="1728"/>
+          </w:tcPr>
+          <w:p>
+            <w:r/>
+            <w:r>
+              <w:rPr>
+                <w:b w:val="0"/>
+                <w:color w:val="886600"/>
+                <w:sz w:val="18"/>
+              </w:rPr>
+              <w:t>2,268</w:t>
+            </w:r>
+          </w:p>
+        </w:tc>
+        <w:tc>
+          <w:tcPr>
+            <w:tcW w:type="dxa" w:w="1728"/>
+          </w:tcPr>
+          <w:p>
+            <w:r/>
+            <w:r>
+              <w:rPr>
+                <w:b w:val="0"/>
+                <w:color w:val="886600"/>
+                <w:sz w:val="18"/>
+              </w:rPr>
+              <w:t>0</w:t>
+            </w:r>
+          </w:p>
+        </w:tc>
+        <w:tc>
+          <w:tcPr>
+            <w:tcW w:type="dxa" w:w="1728"/>
+          </w:tcPr>
+          <w:p>
+            <w:r/>
+            <w:r>
+              <w:rPr>
+                <w:b w:val="0"/>
+                <w:color w:val="886600"/>
+                <w:sz w:val="18"/>
+              </w:rPr>
+              <w:t>108</w:t>
+            </w:r>
+          </w:p>
+        </w:tc>
+      </w:tr>
+      <w:tr>
+        <w:tc>
+          <w:tcPr>
+            <w:tcW w:type="dxa" w:w="1728"/>
+          </w:tcPr>
+          <w:p>
+            <w:r/>
+            <w:r>
+              <w:rPr>
+                <w:b w:val="0"/>
+                <w:sz w:val="18"/>
+              </w:rPr>
+              <w:t>laying</w:t>
+            </w:r>
+          </w:p>
+        </w:tc>
+        <w:tc>
+          <w:tcPr>
+            <w:tcW w:type="dxa" w:w="1728"/>
+          </w:tcPr>
+          <w:p>
+            <w:r/>
+            <w:r>
+              <w:rPr>
+                <w:b w:val="0"/>
+                <w:sz w:val="18"/>
+              </w:rPr>
+              <w:t>cross_domain</w:t>
+            </w:r>
+          </w:p>
+        </w:tc>
+        <w:tc>
+          <w:tcPr>
+            <w:tcW w:type="dxa" w:w="1728"/>
+          </w:tcPr>
+          <w:p>
+            <w:r/>
+            <w:r>
+              <w:rPr>
+                <w:b w:val="0"/>
+                <w:sz w:val="18"/>
+              </w:rPr>
+              <w:t>3,096</w:t>
+            </w:r>
+          </w:p>
+        </w:tc>
+        <w:tc>
+          <w:tcPr>
+            <w:tcW w:type="dxa" w:w="1728"/>
+          </w:tcPr>
+          <w:p>
+            <w:r/>
+            <w:r>
+              <w:rPr>
+                <w:b w:val="0"/>
+                <w:sz w:val="18"/>
+              </w:rPr>
+              <w:t>91</w:t>
+            </w:r>
+          </w:p>
+        </w:tc>
+        <w:tc>
+          <w:tcPr>
+            <w:tcW w:type="dxa" w:w="1728"/>
+          </w:tcPr>
+          <w:p>
+            <w:r/>
+            <w:r>
+              <w:rPr>
+                <w:b w:val="0"/>
+                <w:sz w:val="18"/>
+              </w:rPr>
+              <w:t>77</w:t>
+            </w:r>
+          </w:p>
+        </w:tc>
+      </w:tr>
+      <w:tr>
+        <w:tc>
+          <w:tcPr>
+            <w:tcW w:type="dxa" w:w="1728"/>
+          </w:tcPr>
+          <w:p>
+            <w:r/>
+            <w:r>
+              <w:rPr>
+                <w:b w:val="0"/>
+                <w:sz w:val="18"/>
+              </w:rPr>
+              <w:t>ok</w:t>
+            </w:r>
+          </w:p>
+        </w:tc>
+        <w:tc>
+          <w:tcPr>
+            <w:tcW w:type="dxa" w:w="1728"/>
+          </w:tcPr>
+          <w:p>
+            <w:r/>
+            <w:r>
+              <w:rPr>
+                <w:b w:val="0"/>
+                <w:sz w:val="18"/>
+              </w:rPr>
+              <w:t>cross_domain</w:t>
+            </w:r>
+          </w:p>
+        </w:tc>
+        <w:tc>
+          <w:tcPr>
+            <w:tcW w:type="dxa" w:w="1728"/>
+          </w:tcPr>
+          <w:p>
+            <w:r/>
+            <w:r>
+              <w:rPr>
+                <w:b w:val="0"/>
+                <w:sz w:val="18"/>
+              </w:rPr>
+              <w:t>6,410</w:t>
+            </w:r>
+          </w:p>
+        </w:tc>
+        <w:tc>
+          <w:tcPr>
+            <w:tcW w:type="dxa" w:w="1728"/>
+          </w:tcPr>
+          <w:p>
+            <w:r/>
+            <w:r>
+              <w:rPr>
+                <w:b w:val="0"/>
+                <w:sz w:val="18"/>
+              </w:rPr>
+              <w:t>226</w:t>
+            </w:r>
+          </w:p>
+        </w:tc>
+        <w:tc>
+          <w:tcPr>
+            <w:tcW w:type="dxa" w:w="1728"/>
+          </w:tcPr>
+          <w:p>
+            <w:r/>
+            <w:r>
+              <w:rPr>
+                <w:b w:val="0"/>
+                <w:sz w:val="18"/>
+              </w:rPr>
+              <w:t>45</w:t>
+            </w:r>
+          </w:p>
+        </w:tc>
+      </w:tr>
+      <w:tr>
+        <w:tc>
+          <w:tcPr>
+            <w:tcW w:type="dxa" w:w="1728"/>
+          </w:tcPr>
+          <w:p>
+            <w:r/>
+            <w:r>
+              <w:rPr>
+                <w:b w:val="0"/>
+                <w:sz w:val="18"/>
+              </w:rPr>
+              <w:t>two_finger</w:t>
+            </w:r>
+          </w:p>
+        </w:tc>
+        <w:tc>
+          <w:tcPr>
+            <w:tcW w:type="dxa" w:w="1728"/>
+          </w:tcPr>
+          <w:p>
+            <w:r/>
+            <w:r>
+              <w:rPr>
+                <w:b w:val="0"/>
+                <w:sz w:val="18"/>
+              </w:rPr>
+              <w:t>cross_domain</w:t>
+            </w:r>
+          </w:p>
+        </w:tc>
+        <w:tc>
+          <w:tcPr>
+            <w:tcW w:type="dxa" w:w="1728"/>
+          </w:tcPr>
+          <w:p>
+            <w:r/>
+            <w:r>
+              <w:rPr>
+                <w:b w:val="0"/>
+                <w:sz w:val="18"/>
+              </w:rPr>
+              <w:t>7,000</w:t>
+            </w:r>
+          </w:p>
+        </w:tc>
+        <w:tc>
+          <w:tcPr>
+            <w:tcW w:type="dxa" w:w="1728"/>
+          </w:tcPr>
+          <w:p>
+            <w:r/>
+            <w:r>
+              <w:rPr>
+                <w:b w:val="0"/>
+                <w:sz w:val="18"/>
+              </w:rPr>
+              <w:t>316</w:t>
+            </w:r>
+          </w:p>
+        </w:tc>
+        <w:tc>
+          <w:tcPr>
+            <w:tcW w:type="dxa" w:w="1728"/>
+          </w:tcPr>
+          <w:p>
+            <w:r/>
+            <w:r>
+              <w:rPr>
+                <w:b w:val="0"/>
+                <w:sz w:val="18"/>
+              </w:rPr>
+              <w:t>87</w:t>
+            </w:r>
+          </w:p>
+        </w:tc>
+      </w:tr>
+      <w:tr>
+        <w:tc>
+          <w:tcPr>
+            <w:tcW w:type="dxa" w:w="1728"/>
+          </w:tcPr>
+          <w:p>
+            <w:r/>
+            <w:r>
+              <w:rPr>
+                <w:b w:val="0"/>
+                <w:sz w:val="18"/>
+              </w:rPr>
+              <w:t>thumb</w:t>
+            </w:r>
+          </w:p>
+        </w:tc>
+        <w:tc>
+          <w:tcPr>
+            <w:tcW w:type="dxa" w:w="1728"/>
+          </w:tcPr>
+          <w:p>
+            <w:r/>
+            <w:r>
+              <w:rPr>
+                <w:b w:val="0"/>
+                <w:sz w:val="18"/>
+              </w:rPr>
+              <w:t>held_out_external</w:t>
+            </w:r>
+          </w:p>
+        </w:tc>
+        <w:tc>
+          <w:tcPr>
+            <w:tcW w:type="dxa" w:w="1728"/>
+          </w:tcPr>
+          <w:p>
+            <w:r/>
+            <w:r>
+              <w:rPr>
+                <w:b w:val="0"/>
+                <w:sz w:val="18"/>
+              </w:rPr>
+              <w:t>5,175</w:t>
+            </w:r>
+          </w:p>
+        </w:tc>
+        <w:tc>
+          <w:tcPr>
+            <w:tcW w:type="dxa" w:w="1728"/>
+          </w:tcPr>
+          <w:p>
+            <w:r/>
+            <w:r>
+              <w:rPr>
+                <w:b w:val="0"/>
+                <w:sz w:val="18"/>
+              </w:rPr>
+              <w:t>182</w:t>
+            </w:r>
+          </w:p>
+        </w:tc>
+        <w:tc>
+          <w:tcPr>
+            <w:tcW w:type="dxa" w:w="1728"/>
+          </w:tcPr>
+          <w:p>
+            <w:r/>
+            <w:r>
+              <w:rPr>
+                <w:b w:val="0"/>
+                <w:sz w:val="18"/>
+              </w:rPr>
+              <w:t>214</w:t>
+            </w:r>
+          </w:p>
+        </w:tc>
+      </w:tr>
+      <w:tr>
+        <w:tc>
+          <w:tcPr>
+            <w:tcW w:type="dxa" w:w="1728"/>
+          </w:tcPr>
+          <w:p>
+            <w:r/>
+            <w:r>
+              <w:rPr>
+                <w:b w:val="0"/>
+                <w:sz w:val="18"/>
+              </w:rPr>
+              <w:t>mini_heart</w:t>
+            </w:r>
+          </w:p>
+        </w:tc>
+        <w:tc>
+          <w:tcPr>
+            <w:tcW w:type="dxa" w:w="1728"/>
+          </w:tcPr>
+          <w:p>
+            <w:r/>
+            <w:r>
+              <w:rPr>
+                <w:b w:val="0"/>
+                <w:sz w:val="18"/>
+              </w:rPr>
+              <w:t>cross_domain</w:t>
+            </w:r>
+          </w:p>
+        </w:tc>
+        <w:tc>
+          <w:tcPr>
+            <w:tcW w:type="dxa" w:w="1728"/>
+          </w:tcPr>
+          <w:p>
+            <w:r/>
+            <w:r>
+              <w:rPr>
+                <w:b w:val="0"/>
+                <w:sz w:val="18"/>
+              </w:rPr>
+              <w:t>5,600</w:t>
+            </w:r>
+          </w:p>
+        </w:tc>
+        <w:tc>
+          <w:tcPr>
+            <w:tcW w:type="dxa" w:w="1728"/>
+          </w:tcPr>
+          <w:p>
+            <w:r/>
+            <w:r>
+              <w:rPr>
+                <w:b w:val="0"/>
+                <w:sz w:val="18"/>
+              </w:rPr>
+              <w:t>267</w:t>
+            </w:r>
+          </w:p>
+        </w:tc>
+        <w:tc>
+          <w:tcPr>
+            <w:tcW w:type="dxa" w:w="1728"/>
+          </w:tcPr>
+          <w:p>
+            <w:r/>
+            <w:r>
+              <w:rPr>
+                <w:b w:val="0"/>
+                <w:sz w:val="18"/>
+              </w:rPr>
+              <w:t>45</w:t>
+            </w:r>
+          </w:p>
+        </w:tc>
+      </w:tr>
+      <w:tr>
+        <w:tc>
+          <w:tcPr>
+            <w:tcW w:type="dxa" w:w="1728"/>
+          </w:tcPr>
+          <w:p>
+            <w:r/>
+            <w:r>
+              <w:rPr>
+                <w:b w:val="0"/>
+                <w:sz w:val="18"/>
+              </w:rPr>
+              <w:t>t_pose</w:t>
+            </w:r>
+          </w:p>
+        </w:tc>
+        <w:tc>
+          <w:tcPr>
+            <w:tcW w:type="dxa" w:w="1728"/>
+          </w:tcPr>
+          <w:p>
+            <w:r/>
+            <w:r>
+              <w:rPr>
+                <w:b w:val="0"/>
+                <w:sz w:val="18"/>
+              </w:rPr>
+              <w:t>cross_domain</w:t>
+            </w:r>
+          </w:p>
+        </w:tc>
+        <w:tc>
+          <w:tcPr>
+            <w:tcW w:type="dxa" w:w="1728"/>
+          </w:tcPr>
+          <w:p>
+            <w:r/>
+            <w:r>
+              <w:rPr>
+                <w:b w:val="0"/>
+                <w:sz w:val="18"/>
+              </w:rPr>
+              <w:t>2,349</w:t>
+            </w:r>
+          </w:p>
+        </w:tc>
+        <w:tc>
+          <w:tcPr>
+            <w:tcW w:type="dxa" w:w="1728"/>
+          </w:tcPr>
+          <w:p>
+            <w:r/>
+            <w:r>
+              <w:rPr>
+                <w:b w:val="0"/>
+                <w:sz w:val="18"/>
+              </w:rPr>
+              <w:t>15</w:t>
+            </w:r>
+          </w:p>
+        </w:tc>
+        <w:tc>
+          <w:tcPr>
+            <w:tcW w:type="dxa" w:w="1728"/>
+          </w:tcPr>
+          <w:p>
+            <w:r/>
+            <w:r>
+              <w:rPr>
+                <w:b w:val="0"/>
+                <w:sz w:val="18"/>
+              </w:rPr>
+              <w:t>36</w:t>
+            </w:r>
+          </w:p>
+        </w:tc>
+      </w:tr>
+      <w:tr>
+        <w:tc>
+          <w:tcPr>
+            <w:tcW w:type="dxa" w:w="1728"/>
+          </w:tcPr>
+          <w:p>
+            <w:r/>
+            <w:r>
+              <w:rPr>
+                <w:b w:val="0"/>
+                <w:color w:val="886600"/>
+                <w:sz w:val="18"/>
+              </w:rPr>
+              <w:t>glico_pose</w:t>
+            </w:r>
+          </w:p>
+        </w:tc>
+        <w:tc>
+          <w:tcPr>
+            <w:tcW w:type="dxa" w:w="1728"/>
+          </w:tcPr>
+          <w:p>
+            <w:r/>
+            <w:r>
+              <w:rPr>
+                <w:b w:val="0"/>
+                <w:color w:val="886600"/>
+                <w:sz w:val="18"/>
+              </w:rPr>
+              <w:t>aug_only_leak</w:t>
+            </w:r>
+          </w:p>
+        </w:tc>
+        <w:tc>
+          <w:tcPr>
+            <w:tcW w:type="dxa" w:w="1728"/>
+          </w:tcPr>
+          <w:p>
+            <w:r/>
+            <w:r>
+              <w:rPr>
+                <w:b w:val="0"/>
+                <w:color w:val="886600"/>
+                <w:sz w:val="18"/>
+              </w:rPr>
+              <w:t>2,244</w:t>
+            </w:r>
+          </w:p>
+        </w:tc>
+        <w:tc>
+          <w:tcPr>
+            <w:tcW w:type="dxa" w:w="1728"/>
+          </w:tcPr>
+          <w:p>
+            <w:r/>
+            <w:r>
+              <w:rPr>
+                <w:b w:val="0"/>
+                <w:color w:val="886600"/>
+                <w:sz w:val="18"/>
+              </w:rPr>
+              <w:t>0</w:t>
+            </w:r>
+          </w:p>
+        </w:tc>
+        <w:tc>
+          <w:tcPr>
+            <w:tcW w:type="dxa" w:w="1728"/>
+          </w:tcPr>
+          <w:p>
+            <w:r/>
+            <w:r>
+              <w:rPr>
+                <w:b w:val="0"/>
+                <w:color w:val="886600"/>
+                <w:sz w:val="18"/>
+              </w:rPr>
+              <w:t>66</w:t>
+            </w:r>
+          </w:p>
+        </w:tc>
+      </w:tr>
+    </w:tbl>
+    <w:p>
+      <w:r>
+        <w:t>eval type — cross_domain: external train, our-footage test (a real generalisation number). held_out_external (thumb): cross-subject within HaGRID. aug_only_leak (squat, glico_pose): train is augmented copies of the s01 frames, so the test number leaks and is NOT counted in 'real-eval'. Phase 6 field recordings are the real gate for those two.</w:t>
       </w:r>
     </w:p>
     <w:p>
@@ -5628,6 +6681,454 @@
     </w:tbl>
     <w:p>
       <w:r>
+        <w:rPr>
+          <w:b/>
+        </w:rPr>
+        <w:t>Where it errs — the biggest confusion pairs on the test set:</w:t>
+      </w:r>
+    </w:p>
+    <w:tbl>
+      <w:tblPr>
+        <w:tblStyle w:val="LightGrid-Accent1"/>
+        <w:tblW w:type="auto" w:w="0"/>
+        <w:tblLook w:firstColumn="1" w:firstRow="1" w:lastColumn="0" w:lastRow="0" w:noHBand="0" w:noVBand="1" w:val="04A0"/>
+      </w:tblPr>
+      <w:tblGrid>
+        <w:gridCol w:w="2880"/>
+        <w:gridCol w:w="2880"/>
+        <w:gridCol w:w="2880"/>
+      </w:tblGrid>
+      <w:tr>
+        <w:tc>
+          <w:tcPr>
+            <w:tcW w:type="dxa" w:w="2880"/>
+          </w:tcPr>
+          <w:p>
+            <w:r/>
+            <w:r>
+              <w:rPr>
+                <w:b/>
+                <w:sz w:val="18"/>
+              </w:rPr>
+              <w:t>true class</w:t>
+            </w:r>
+          </w:p>
+        </w:tc>
+        <w:tc>
+          <w:tcPr>
+            <w:tcW w:type="dxa" w:w="2880"/>
+          </w:tcPr>
+          <w:p>
+            <w:r/>
+            <w:r>
+              <w:rPr>
+                <w:b/>
+                <w:sz w:val="18"/>
+              </w:rPr>
+              <w:t>predicted as</w:t>
+            </w:r>
+          </w:p>
+        </w:tc>
+        <w:tc>
+          <w:tcPr>
+            <w:tcW w:type="dxa" w:w="2880"/>
+          </w:tcPr>
+          <w:p>
+            <w:r/>
+            <w:r>
+              <w:rPr>
+                <w:b/>
+                <w:sz w:val="18"/>
+              </w:rPr>
+              <w:t>count</w:t>
+            </w:r>
+          </w:p>
+        </w:tc>
+      </w:tr>
+      <w:tr>
+        <w:tc>
+          <w:tcPr>
+            <w:tcW w:type="dxa" w:w="2880"/>
+          </w:tcPr>
+          <w:p>
+            <w:r/>
+            <w:r>
+              <w:rPr>
+                <w:b w:val="0"/>
+                <w:sz w:val="18"/>
+              </w:rPr>
+              <w:t>raise_right_hand</w:t>
+            </w:r>
+          </w:p>
+        </w:tc>
+        <w:tc>
+          <w:tcPr>
+            <w:tcW w:type="dxa" w:w="2880"/>
+          </w:tcPr>
+          <w:p>
+            <w:r/>
+            <w:r>
+              <w:rPr>
+                <w:b w:val="0"/>
+                <w:sz w:val="18"/>
+              </w:rPr>
+              <w:t>idle</w:t>
+            </w:r>
+          </w:p>
+        </w:tc>
+        <w:tc>
+          <w:tcPr>
+            <w:tcW w:type="dxa" w:w="2880"/>
+          </w:tcPr>
+          <w:p>
+            <w:r/>
+            <w:r>
+              <w:rPr>
+                <w:b w:val="0"/>
+                <w:sz w:val="18"/>
+              </w:rPr>
+              <w:t>18</w:t>
+            </w:r>
+          </w:p>
+        </w:tc>
+      </w:tr>
+      <w:tr>
+        <w:tc>
+          <w:tcPr>
+            <w:tcW w:type="dxa" w:w="2880"/>
+          </w:tcPr>
+          <w:p>
+            <w:r/>
+            <w:r>
+              <w:rPr>
+                <w:b w:val="0"/>
+                <w:sz w:val="18"/>
+              </w:rPr>
+              <w:t>laying</w:t>
+            </w:r>
+          </w:p>
+        </w:tc>
+        <w:tc>
+          <w:tcPr>
+            <w:tcW w:type="dxa" w:w="2880"/>
+          </w:tcPr>
+          <w:p>
+            <w:r/>
+            <w:r>
+              <w:rPr>
+                <w:b w:val="0"/>
+                <w:sz w:val="18"/>
+              </w:rPr>
+              <w:t>raise_left_hand</w:t>
+            </w:r>
+          </w:p>
+        </w:tc>
+        <w:tc>
+          <w:tcPr>
+            <w:tcW w:type="dxa" w:w="2880"/>
+          </w:tcPr>
+          <w:p>
+            <w:r/>
+            <w:r>
+              <w:rPr>
+                <w:b w:val="0"/>
+                <w:sz w:val="18"/>
+              </w:rPr>
+              <w:t>14</w:t>
+            </w:r>
+          </w:p>
+        </w:tc>
+      </w:tr>
+      <w:tr>
+        <w:tc>
+          <w:tcPr>
+            <w:tcW w:type="dxa" w:w="2880"/>
+          </w:tcPr>
+          <w:p>
+            <w:r/>
+            <w:r>
+              <w:rPr>
+                <w:b w:val="0"/>
+                <w:sz w:val="18"/>
+              </w:rPr>
+              <w:t>mini_heart</w:t>
+            </w:r>
+          </w:p>
+        </w:tc>
+        <w:tc>
+          <w:tcPr>
+            <w:tcW w:type="dxa" w:w="2880"/>
+          </w:tcPr>
+          <w:p>
+            <w:r/>
+            <w:r>
+              <w:rPr>
+                <w:b w:val="0"/>
+                <w:sz w:val="18"/>
+              </w:rPr>
+              <w:t>raise_right_hand</w:t>
+            </w:r>
+          </w:p>
+        </w:tc>
+        <w:tc>
+          <w:tcPr>
+            <w:tcW w:type="dxa" w:w="2880"/>
+          </w:tcPr>
+          <w:p>
+            <w:r/>
+            <w:r>
+              <w:rPr>
+                <w:b w:val="0"/>
+                <w:sz w:val="18"/>
+              </w:rPr>
+              <w:t>12</w:t>
+            </w:r>
+          </w:p>
+        </w:tc>
+      </w:tr>
+      <w:tr>
+        <w:tc>
+          <w:tcPr>
+            <w:tcW w:type="dxa" w:w="2880"/>
+          </w:tcPr>
+          <w:p>
+            <w:r/>
+            <w:r>
+              <w:rPr>
+                <w:b w:val="0"/>
+                <w:sz w:val="18"/>
+              </w:rPr>
+              <w:t>ok</w:t>
+            </w:r>
+          </w:p>
+        </w:tc>
+        <w:tc>
+          <w:tcPr>
+            <w:tcW w:type="dxa" w:w="2880"/>
+          </w:tcPr>
+          <w:p>
+            <w:r/>
+            <w:r>
+              <w:rPr>
+                <w:b w:val="0"/>
+                <w:sz w:val="18"/>
+              </w:rPr>
+              <w:t>idle</w:t>
+            </w:r>
+          </w:p>
+        </w:tc>
+        <w:tc>
+          <w:tcPr>
+            <w:tcW w:type="dxa" w:w="2880"/>
+          </w:tcPr>
+          <w:p>
+            <w:r/>
+            <w:r>
+              <w:rPr>
+                <w:b w:val="0"/>
+                <w:sz w:val="18"/>
+              </w:rPr>
+              <w:t>8</w:t>
+            </w:r>
+          </w:p>
+        </w:tc>
+      </w:tr>
+      <w:tr>
+        <w:tc>
+          <w:tcPr>
+            <w:tcW w:type="dxa" w:w="2880"/>
+          </w:tcPr>
+          <w:p>
+            <w:r/>
+            <w:r>
+              <w:rPr>
+                <w:b w:val="0"/>
+                <w:sz w:val="18"/>
+              </w:rPr>
+              <w:t>t_pose</w:t>
+            </w:r>
+          </w:p>
+        </w:tc>
+        <w:tc>
+          <w:tcPr>
+            <w:tcW w:type="dxa" w:w="2880"/>
+          </w:tcPr>
+          <w:p>
+            <w:r/>
+            <w:r>
+              <w:rPr>
+                <w:b w:val="0"/>
+                <w:sz w:val="18"/>
+              </w:rPr>
+              <w:t>sit</w:t>
+            </w:r>
+          </w:p>
+        </w:tc>
+        <w:tc>
+          <w:tcPr>
+            <w:tcW w:type="dxa" w:w="2880"/>
+          </w:tcPr>
+          <w:p>
+            <w:r/>
+            <w:r>
+              <w:rPr>
+                <w:b w:val="0"/>
+                <w:sz w:val="18"/>
+              </w:rPr>
+              <w:t>7</w:t>
+            </w:r>
+          </w:p>
+        </w:tc>
+      </w:tr>
+      <w:tr>
+        <w:tc>
+          <w:tcPr>
+            <w:tcW w:type="dxa" w:w="2880"/>
+          </w:tcPr>
+          <w:p>
+            <w:r/>
+            <w:r>
+              <w:rPr>
+                <w:b w:val="0"/>
+                <w:sz w:val="18"/>
+              </w:rPr>
+              <w:t>ok</w:t>
+            </w:r>
+          </w:p>
+        </w:tc>
+        <w:tc>
+          <w:tcPr>
+            <w:tcW w:type="dxa" w:w="2880"/>
+          </w:tcPr>
+          <w:p>
+            <w:r/>
+            <w:r>
+              <w:rPr>
+                <w:b w:val="0"/>
+                <w:sz w:val="18"/>
+              </w:rPr>
+              <w:t>sit</w:t>
+            </w:r>
+          </w:p>
+        </w:tc>
+        <w:tc>
+          <w:tcPr>
+            <w:tcW w:type="dxa" w:w="2880"/>
+          </w:tcPr>
+          <w:p>
+            <w:r/>
+            <w:r>
+              <w:rPr>
+                <w:b w:val="0"/>
+                <w:sz w:val="18"/>
+              </w:rPr>
+              <w:t>6</w:t>
+            </w:r>
+          </w:p>
+        </w:tc>
+      </w:tr>
+      <w:tr>
+        <w:tc>
+          <w:tcPr>
+            <w:tcW w:type="dxa" w:w="2880"/>
+          </w:tcPr>
+          <w:p>
+            <w:r/>
+            <w:r>
+              <w:rPr>
+                <w:b w:val="0"/>
+                <w:sz w:val="18"/>
+              </w:rPr>
+              <w:t>sit</w:t>
+            </w:r>
+          </w:p>
+        </w:tc>
+        <w:tc>
+          <w:tcPr>
+            <w:tcW w:type="dxa" w:w="2880"/>
+          </w:tcPr>
+          <w:p>
+            <w:r/>
+            <w:r>
+              <w:rPr>
+                <w:b w:val="0"/>
+                <w:sz w:val="18"/>
+              </w:rPr>
+              <w:t>idle</w:t>
+            </w:r>
+          </w:p>
+        </w:tc>
+        <w:tc>
+          <w:tcPr>
+            <w:tcW w:type="dxa" w:w="2880"/>
+          </w:tcPr>
+          <w:p>
+            <w:r/>
+            <w:r>
+              <w:rPr>
+                <w:b w:val="0"/>
+                <w:sz w:val="18"/>
+              </w:rPr>
+              <w:t>5</w:t>
+            </w:r>
+          </w:p>
+        </w:tc>
+      </w:tr>
+      <w:tr>
+        <w:tc>
+          <w:tcPr>
+            <w:tcW w:type="dxa" w:w="2880"/>
+          </w:tcPr>
+          <w:p>
+            <w:r/>
+            <w:r>
+              <w:rPr>
+                <w:b w:val="0"/>
+                <w:sz w:val="18"/>
+              </w:rPr>
+              <w:t>raise_right_hand</w:t>
+            </w:r>
+          </w:p>
+        </w:tc>
+        <w:tc>
+          <w:tcPr>
+            <w:tcW w:type="dxa" w:w="2880"/>
+          </w:tcPr>
+          <w:p>
+            <w:r/>
+            <w:r>
+              <w:rPr>
+                <w:b w:val="0"/>
+                <w:sz w:val="18"/>
+              </w:rPr>
+              <w:t>sit</w:t>
+            </w:r>
+          </w:p>
+        </w:tc>
+        <w:tc>
+          <w:tcPr>
+            <w:tcW w:type="dxa" w:w="2880"/>
+          </w:tcPr>
+          <w:p>
+            <w:r/>
+            <w:r>
+              <w:rPr>
+                <w:b w:val="0"/>
+                <w:sz w:val="18"/>
+              </w:rPr>
+              <w:t>4</w:t>
+            </w:r>
+          </w:p>
+        </w:tc>
+      </w:tr>
+    </w:tbl>
+    <w:p>
+      <w:r>
+        <w:t>The pattern is recall loss, not cross-gesture mix-ups: real gestures (raise_right_hand, ok) fall to idle, and mini_heart falls to raise_right_hand (elevated-arm training rows). idle itself is only over-predicted mildly. This is the data/feature-gap signature — Track B/D/E and Phase 6.</w:t>
+      </w:r>
+    </w:p>
+    <w:p>
+      <w:r>
         <w:drawing>
           <wp:inline xmlns:a="http://schemas.openxmlformats.org/drawingml/2006/main" xmlns:pic="http://schemas.openxmlformats.org/drawingml/2006/picture">
             <wp:extent cx="5852160" cy="5201327"/>
@@ -5699,6 +7200,47 @@
       </w:r>
     </w:p>
     <w:p>
+      <w:r>
+        <w:t>Runner-up LightGBM, same test set (for comparison):</w:t>
+      </w:r>
+    </w:p>
+    <w:p>
+      <w:r>
+        <w:drawing>
+          <wp:inline xmlns:a="http://schemas.openxmlformats.org/drawingml/2006/main" xmlns:pic="http://schemas.openxmlformats.org/drawingml/2006/picture">
+            <wp:extent cx="5852160" cy="5201327"/>
+            <wp:docPr id="6" name="Picture 6"/>
+            <wp:cNvGraphicFramePr>
+              <a:graphicFrameLocks noChangeAspect="1"/>
+            </wp:cNvGraphicFramePr>
+            <a:graphic>
+              <a:graphicData uri="http://schemas.openxmlformats.org/drawingml/2006/picture">
+                <pic:pic>
+                  <pic:nvPicPr>
+                    <pic:cNvPr id="0" name="lgbm_confusion.png"/>
+                    <pic:cNvPicPr/>
+                  </pic:nvPicPr>
+                  <pic:blipFill>
+                    <a:blip r:embed="rId14"/>
+                    <a:stretch>
+                      <a:fillRect/>
+                    </a:stretch>
+                  </pic:blipFill>
+                  <pic:spPr>
+                    <a:xfrm>
+                      <a:off x="0" y="0"/>
+                      <a:ext cx="5852160" cy="5201327"/>
+                    </a:xfrm>
+                    <a:prstGeom prst="rect"/>
+                  </pic:spPr>
+                </pic:pic>
+              </a:graphicData>
+            </a:graphic>
+          </wp:inline>
+        </w:drawing>
+      </w:r>
+    </w:p>
+    <w:p>
       <w:pPr>
         <w:pStyle w:val="Heading1"/>
       </w:pPr>
@@ -6045,7 +7587,1030 @@
     </w:p>
     <w:p>
       <w:r>
-        <w:t>Worth keeping: the gate is interpretable — it suppresses the off-hand for one-hand gestures (raise_right → left-hand block ≈ 0.16, right-hand ≈ 0.48; raise_left the mirror), leans on the joint-angle block for postures, and keeps that block the most open overall. This is a third independent confirmation (with Track B's body_raw_hands_derived) that the idle class is fragile to anything that reduces feature information.</w:t>
+        <w:rPr>
+          <w:b/>
+        </w:rPr>
+        <w:t>Worth keeping: the gate is interpretable. Mean SE multiplier per feature block, by true class on the test set (1.0 = fully kept, 0.0 = suppressed):</w:t>
+      </w:r>
+    </w:p>
+    <w:tbl>
+      <w:tblPr>
+        <w:tblStyle w:val="LightGrid-Accent1"/>
+        <w:tblW w:type="auto" w:w="0"/>
+        <w:tblLook w:firstColumn="1" w:firstRow="1" w:lastColumn="0" w:lastRow="0" w:noHBand="0" w:noVBand="1" w:val="04A0"/>
+      </w:tblPr>
+      <w:tblGrid>
+        <w:gridCol w:w="1728"/>
+        <w:gridCol w:w="1728"/>
+        <w:gridCol w:w="1728"/>
+        <w:gridCol w:w="1728"/>
+        <w:gridCol w:w="1728"/>
+      </w:tblGrid>
+      <w:tr>
+        <w:tc>
+          <w:tcPr>
+            <w:tcW w:type="dxa" w:w="1728"/>
+          </w:tcPr>
+          <w:p>
+            <w:r/>
+            <w:r>
+              <w:rPr>
+                <w:b/>
+                <w:sz w:val="18"/>
+              </w:rPr>
+              <w:t>class</w:t>
+            </w:r>
+          </w:p>
+        </w:tc>
+        <w:tc>
+          <w:tcPr>
+            <w:tcW w:type="dxa" w:w="1728"/>
+          </w:tcPr>
+          <w:p>
+            <w:r/>
+            <w:r>
+              <w:rPr>
+                <w:b/>
+                <w:sz w:val="18"/>
+              </w:rPr>
+              <w:t>body xy</w:t>
+            </w:r>
+          </w:p>
+        </w:tc>
+        <w:tc>
+          <w:tcPr>
+            <w:tcW w:type="dxa" w:w="1728"/>
+          </w:tcPr>
+          <w:p>
+            <w:r/>
+            <w:r>
+              <w:rPr>
+                <w:b/>
+                <w:sz w:val="18"/>
+              </w:rPr>
+              <w:t>L-hand</w:t>
+            </w:r>
+          </w:p>
+        </w:tc>
+        <w:tc>
+          <w:tcPr>
+            <w:tcW w:type="dxa" w:w="1728"/>
+          </w:tcPr>
+          <w:p>
+            <w:r/>
+            <w:r>
+              <w:rPr>
+                <w:b/>
+                <w:sz w:val="18"/>
+              </w:rPr>
+              <w:t>R-hand</w:t>
+            </w:r>
+          </w:p>
+        </w:tc>
+        <w:tc>
+          <w:tcPr>
+            <w:tcW w:type="dxa" w:w="1728"/>
+          </w:tcPr>
+          <w:p>
+            <w:r/>
+            <w:r>
+              <w:rPr>
+                <w:b/>
+                <w:sz w:val="18"/>
+              </w:rPr>
+              <w:t>joint angles</w:t>
+            </w:r>
+          </w:p>
+        </w:tc>
+      </w:tr>
+      <w:tr>
+        <w:tc>
+          <w:tcPr>
+            <w:tcW w:type="dxa" w:w="1728"/>
+          </w:tcPr>
+          <w:p>
+            <w:r/>
+            <w:r>
+              <w:rPr>
+                <w:b w:val="0"/>
+                <w:sz w:val="18"/>
+              </w:rPr>
+              <w:t>idle</w:t>
+            </w:r>
+          </w:p>
+        </w:tc>
+        <w:tc>
+          <w:tcPr>
+            <w:tcW w:type="dxa" w:w="1728"/>
+          </w:tcPr>
+          <w:p>
+            <w:r/>
+            <w:r>
+              <w:rPr>
+                <w:b w:val="0"/>
+                <w:sz w:val="18"/>
+              </w:rPr>
+              <w:t>0.70</w:t>
+            </w:r>
+          </w:p>
+        </w:tc>
+        <w:tc>
+          <w:tcPr>
+            <w:tcW w:type="dxa" w:w="1728"/>
+          </w:tcPr>
+          <w:p>
+            <w:r/>
+            <w:r>
+              <w:rPr>
+                <w:b w:val="0"/>
+                <w:sz w:val="18"/>
+              </w:rPr>
+              <w:t>0.60</w:t>
+            </w:r>
+          </w:p>
+        </w:tc>
+        <w:tc>
+          <w:tcPr>
+            <w:tcW w:type="dxa" w:w="1728"/>
+          </w:tcPr>
+          <w:p>
+            <w:r/>
+            <w:r>
+              <w:rPr>
+                <w:b w:val="0"/>
+                <w:sz w:val="18"/>
+              </w:rPr>
+              <w:t>0.61</w:t>
+            </w:r>
+          </w:p>
+        </w:tc>
+        <w:tc>
+          <w:tcPr>
+            <w:tcW w:type="dxa" w:w="1728"/>
+          </w:tcPr>
+          <w:p>
+            <w:r/>
+            <w:r>
+              <w:rPr>
+                <w:b w:val="0"/>
+                <w:sz w:val="18"/>
+              </w:rPr>
+              <w:t>0.74</w:t>
+            </w:r>
+          </w:p>
+        </w:tc>
+      </w:tr>
+      <w:tr>
+        <w:tc>
+          <w:tcPr>
+            <w:tcW w:type="dxa" w:w="1728"/>
+          </w:tcPr>
+          <w:p>
+            <w:r/>
+            <w:r>
+              <w:rPr>
+                <w:b w:val="0"/>
+                <w:sz w:val="18"/>
+              </w:rPr>
+              <w:t>raise_right_hand</w:t>
+            </w:r>
+          </w:p>
+        </w:tc>
+        <w:tc>
+          <w:tcPr>
+            <w:tcW w:type="dxa" w:w="1728"/>
+          </w:tcPr>
+          <w:p>
+            <w:r/>
+            <w:r>
+              <w:rPr>
+                <w:b w:val="0"/>
+                <w:sz w:val="18"/>
+              </w:rPr>
+              <w:t>0.65</w:t>
+            </w:r>
+          </w:p>
+        </w:tc>
+        <w:tc>
+          <w:tcPr>
+            <w:tcW w:type="dxa" w:w="1728"/>
+          </w:tcPr>
+          <w:p>
+            <w:r/>
+            <w:r>
+              <w:rPr>
+                <w:b w:val="0"/>
+                <w:sz w:val="18"/>
+              </w:rPr>
+              <w:t>0.56</w:t>
+            </w:r>
+          </w:p>
+        </w:tc>
+        <w:tc>
+          <w:tcPr>
+            <w:tcW w:type="dxa" w:w="1728"/>
+          </w:tcPr>
+          <w:p>
+            <w:r/>
+            <w:r>
+              <w:rPr>
+                <w:b w:val="0"/>
+                <w:sz w:val="18"/>
+              </w:rPr>
+              <w:t>0.72</w:t>
+            </w:r>
+          </w:p>
+        </w:tc>
+        <w:tc>
+          <w:tcPr>
+            <w:tcW w:type="dxa" w:w="1728"/>
+          </w:tcPr>
+          <w:p>
+            <w:r/>
+            <w:r>
+              <w:rPr>
+                <w:b w:val="0"/>
+                <w:sz w:val="18"/>
+              </w:rPr>
+              <w:t>0.73</w:t>
+            </w:r>
+          </w:p>
+        </w:tc>
+      </w:tr>
+      <w:tr>
+        <w:tc>
+          <w:tcPr>
+            <w:tcW w:type="dxa" w:w="1728"/>
+          </w:tcPr>
+          <w:p>
+            <w:r/>
+            <w:r>
+              <w:rPr>
+                <w:b w:val="0"/>
+                <w:sz w:val="18"/>
+              </w:rPr>
+              <w:t>raise_left_hand</w:t>
+            </w:r>
+          </w:p>
+        </w:tc>
+        <w:tc>
+          <w:tcPr>
+            <w:tcW w:type="dxa" w:w="1728"/>
+          </w:tcPr>
+          <w:p>
+            <w:r/>
+            <w:r>
+              <w:rPr>
+                <w:b w:val="0"/>
+                <w:sz w:val="18"/>
+              </w:rPr>
+              <w:t>0.63</w:t>
+            </w:r>
+          </w:p>
+        </w:tc>
+        <w:tc>
+          <w:tcPr>
+            <w:tcW w:type="dxa" w:w="1728"/>
+          </w:tcPr>
+          <w:p>
+            <w:r/>
+            <w:r>
+              <w:rPr>
+                <w:b w:val="0"/>
+                <w:sz w:val="18"/>
+              </w:rPr>
+              <w:t>0.81</w:t>
+            </w:r>
+          </w:p>
+        </w:tc>
+        <w:tc>
+          <w:tcPr>
+            <w:tcW w:type="dxa" w:w="1728"/>
+          </w:tcPr>
+          <w:p>
+            <w:r/>
+            <w:r>
+              <w:rPr>
+                <w:b w:val="0"/>
+                <w:sz w:val="18"/>
+              </w:rPr>
+              <w:t>0.53</w:t>
+            </w:r>
+          </w:p>
+        </w:tc>
+        <w:tc>
+          <w:tcPr>
+            <w:tcW w:type="dxa" w:w="1728"/>
+          </w:tcPr>
+          <w:p>
+            <w:r/>
+            <w:r>
+              <w:rPr>
+                <w:b w:val="0"/>
+                <w:sz w:val="18"/>
+              </w:rPr>
+              <w:t>0.69</w:t>
+            </w:r>
+          </w:p>
+        </w:tc>
+      </w:tr>
+      <w:tr>
+        <w:tc>
+          <w:tcPr>
+            <w:tcW w:type="dxa" w:w="1728"/>
+          </w:tcPr>
+          <w:p>
+            <w:r/>
+            <w:r>
+              <w:rPr>
+                <w:b w:val="0"/>
+                <w:sz w:val="18"/>
+              </w:rPr>
+              <w:t>sit</w:t>
+            </w:r>
+          </w:p>
+        </w:tc>
+        <w:tc>
+          <w:tcPr>
+            <w:tcW w:type="dxa" w:w="1728"/>
+          </w:tcPr>
+          <w:p>
+            <w:r/>
+            <w:r>
+              <w:rPr>
+                <w:b w:val="0"/>
+                <w:sz w:val="18"/>
+              </w:rPr>
+              <w:t>0.70</w:t>
+            </w:r>
+          </w:p>
+        </w:tc>
+        <w:tc>
+          <w:tcPr>
+            <w:tcW w:type="dxa" w:w="1728"/>
+          </w:tcPr>
+          <w:p>
+            <w:r/>
+            <w:r>
+              <w:rPr>
+                <w:b w:val="0"/>
+                <w:sz w:val="18"/>
+              </w:rPr>
+              <w:t>0.61</w:t>
+            </w:r>
+          </w:p>
+        </w:tc>
+        <w:tc>
+          <w:tcPr>
+            <w:tcW w:type="dxa" w:w="1728"/>
+          </w:tcPr>
+          <w:p>
+            <w:r/>
+            <w:r>
+              <w:rPr>
+                <w:b w:val="0"/>
+                <w:sz w:val="18"/>
+              </w:rPr>
+              <w:t>0.60</w:t>
+            </w:r>
+          </w:p>
+        </w:tc>
+        <w:tc>
+          <w:tcPr>
+            <w:tcW w:type="dxa" w:w="1728"/>
+          </w:tcPr>
+          <w:p>
+            <w:r/>
+            <w:r>
+              <w:rPr>
+                <w:b w:val="0"/>
+                <w:sz w:val="18"/>
+              </w:rPr>
+              <w:t>0.73</w:t>
+            </w:r>
+          </w:p>
+        </w:tc>
+      </w:tr>
+      <w:tr>
+        <w:tc>
+          <w:tcPr>
+            <w:tcW w:type="dxa" w:w="1728"/>
+          </w:tcPr>
+          <w:p>
+            <w:r/>
+            <w:r>
+              <w:rPr>
+                <w:b w:val="0"/>
+                <w:sz w:val="18"/>
+              </w:rPr>
+              <w:t>squat</w:t>
+            </w:r>
+          </w:p>
+        </w:tc>
+        <w:tc>
+          <w:tcPr>
+            <w:tcW w:type="dxa" w:w="1728"/>
+          </w:tcPr>
+          <w:p>
+            <w:r/>
+            <w:r>
+              <w:rPr>
+                <w:b w:val="0"/>
+                <w:sz w:val="18"/>
+              </w:rPr>
+              <w:t>0.67</w:t>
+            </w:r>
+          </w:p>
+        </w:tc>
+        <w:tc>
+          <w:tcPr>
+            <w:tcW w:type="dxa" w:w="1728"/>
+          </w:tcPr>
+          <w:p>
+            <w:r/>
+            <w:r>
+              <w:rPr>
+                <w:b w:val="0"/>
+                <w:sz w:val="18"/>
+              </w:rPr>
+              <w:t>0.60</w:t>
+            </w:r>
+          </w:p>
+        </w:tc>
+        <w:tc>
+          <w:tcPr>
+            <w:tcW w:type="dxa" w:w="1728"/>
+          </w:tcPr>
+          <w:p>
+            <w:r/>
+            <w:r>
+              <w:rPr>
+                <w:b w:val="0"/>
+                <w:sz w:val="18"/>
+              </w:rPr>
+              <w:t>0.59</w:t>
+            </w:r>
+          </w:p>
+        </w:tc>
+        <w:tc>
+          <w:tcPr>
+            <w:tcW w:type="dxa" w:w="1728"/>
+          </w:tcPr>
+          <w:p>
+            <w:r/>
+            <w:r>
+              <w:rPr>
+                <w:b w:val="0"/>
+                <w:sz w:val="18"/>
+              </w:rPr>
+              <w:t>0.65</w:t>
+            </w:r>
+          </w:p>
+        </w:tc>
+      </w:tr>
+      <w:tr>
+        <w:tc>
+          <w:tcPr>
+            <w:tcW w:type="dxa" w:w="1728"/>
+          </w:tcPr>
+          <w:p>
+            <w:r/>
+            <w:r>
+              <w:rPr>
+                <w:b w:val="0"/>
+                <w:sz w:val="18"/>
+              </w:rPr>
+              <w:t>laying</w:t>
+            </w:r>
+          </w:p>
+        </w:tc>
+        <w:tc>
+          <w:tcPr>
+            <w:tcW w:type="dxa" w:w="1728"/>
+          </w:tcPr>
+          <w:p>
+            <w:r/>
+            <w:r>
+              <w:rPr>
+                <w:b w:val="0"/>
+                <w:sz w:val="18"/>
+              </w:rPr>
+              <w:t>0.70</w:t>
+            </w:r>
+          </w:p>
+        </w:tc>
+        <w:tc>
+          <w:tcPr>
+            <w:tcW w:type="dxa" w:w="1728"/>
+          </w:tcPr>
+          <w:p>
+            <w:r/>
+            <w:r>
+              <w:rPr>
+                <w:b w:val="0"/>
+                <w:sz w:val="18"/>
+              </w:rPr>
+              <w:t>0.67</w:t>
+            </w:r>
+          </w:p>
+        </w:tc>
+        <w:tc>
+          <w:tcPr>
+            <w:tcW w:type="dxa" w:w="1728"/>
+          </w:tcPr>
+          <w:p>
+            <w:r/>
+            <w:r>
+              <w:rPr>
+                <w:b w:val="0"/>
+                <w:sz w:val="18"/>
+              </w:rPr>
+              <w:t>0.55</w:t>
+            </w:r>
+          </w:p>
+        </w:tc>
+        <w:tc>
+          <w:tcPr>
+            <w:tcW w:type="dxa" w:w="1728"/>
+          </w:tcPr>
+          <w:p>
+            <w:r/>
+            <w:r>
+              <w:rPr>
+                <w:b w:val="0"/>
+                <w:sz w:val="18"/>
+              </w:rPr>
+              <w:t>0.83</w:t>
+            </w:r>
+          </w:p>
+        </w:tc>
+      </w:tr>
+      <w:tr>
+        <w:tc>
+          <w:tcPr>
+            <w:tcW w:type="dxa" w:w="1728"/>
+          </w:tcPr>
+          <w:p>
+            <w:r/>
+            <w:r>
+              <w:rPr>
+                <w:b w:val="0"/>
+                <w:sz w:val="18"/>
+              </w:rPr>
+              <w:t>ok</w:t>
+            </w:r>
+          </w:p>
+        </w:tc>
+        <w:tc>
+          <w:tcPr>
+            <w:tcW w:type="dxa" w:w="1728"/>
+          </w:tcPr>
+          <w:p>
+            <w:r/>
+            <w:r>
+              <w:rPr>
+                <w:b w:val="0"/>
+                <w:sz w:val="18"/>
+              </w:rPr>
+              <w:t>0.66</w:t>
+            </w:r>
+          </w:p>
+        </w:tc>
+        <w:tc>
+          <w:tcPr>
+            <w:tcW w:type="dxa" w:w="1728"/>
+          </w:tcPr>
+          <w:p>
+            <w:r/>
+            <w:r>
+              <w:rPr>
+                <w:b w:val="0"/>
+                <w:sz w:val="18"/>
+              </w:rPr>
+              <w:t>0.55</w:t>
+            </w:r>
+          </w:p>
+        </w:tc>
+        <w:tc>
+          <w:tcPr>
+            <w:tcW w:type="dxa" w:w="1728"/>
+          </w:tcPr>
+          <w:p>
+            <w:r/>
+            <w:r>
+              <w:rPr>
+                <w:b w:val="0"/>
+                <w:sz w:val="18"/>
+              </w:rPr>
+              <w:t>0.73</w:t>
+            </w:r>
+          </w:p>
+        </w:tc>
+        <w:tc>
+          <w:tcPr>
+            <w:tcW w:type="dxa" w:w="1728"/>
+          </w:tcPr>
+          <w:p>
+            <w:r/>
+            <w:r>
+              <w:rPr>
+                <w:b w:val="0"/>
+                <w:sz w:val="18"/>
+              </w:rPr>
+              <w:t>0.72</w:t>
+            </w:r>
+          </w:p>
+        </w:tc>
+      </w:tr>
+      <w:tr>
+        <w:tc>
+          <w:tcPr>
+            <w:tcW w:type="dxa" w:w="1728"/>
+          </w:tcPr>
+          <w:p>
+            <w:r/>
+            <w:r>
+              <w:rPr>
+                <w:b w:val="0"/>
+                <w:sz w:val="18"/>
+              </w:rPr>
+              <w:t>two_finger</w:t>
+            </w:r>
+          </w:p>
+        </w:tc>
+        <w:tc>
+          <w:tcPr>
+            <w:tcW w:type="dxa" w:w="1728"/>
+          </w:tcPr>
+          <w:p>
+            <w:r/>
+            <w:r>
+              <w:rPr>
+                <w:b w:val="0"/>
+                <w:sz w:val="18"/>
+              </w:rPr>
+              <w:t>0.64</w:t>
+            </w:r>
+          </w:p>
+        </w:tc>
+        <w:tc>
+          <w:tcPr>
+            <w:tcW w:type="dxa" w:w="1728"/>
+          </w:tcPr>
+          <w:p>
+            <w:r/>
+            <w:r>
+              <w:rPr>
+                <w:b w:val="0"/>
+                <w:sz w:val="18"/>
+              </w:rPr>
+              <w:t>0.53</w:t>
+            </w:r>
+          </w:p>
+        </w:tc>
+        <w:tc>
+          <w:tcPr>
+            <w:tcW w:type="dxa" w:w="1728"/>
+          </w:tcPr>
+          <w:p>
+            <w:r/>
+            <w:r>
+              <w:rPr>
+                <w:b w:val="0"/>
+                <w:sz w:val="18"/>
+              </w:rPr>
+              <w:t>0.77</w:t>
+            </w:r>
+          </w:p>
+        </w:tc>
+        <w:tc>
+          <w:tcPr>
+            <w:tcW w:type="dxa" w:w="1728"/>
+          </w:tcPr>
+          <w:p>
+            <w:r/>
+            <w:r>
+              <w:rPr>
+                <w:b w:val="0"/>
+                <w:sz w:val="18"/>
+              </w:rPr>
+              <w:t>0.71</w:t>
+            </w:r>
+          </w:p>
+        </w:tc>
+      </w:tr>
+      <w:tr>
+        <w:tc>
+          <w:tcPr>
+            <w:tcW w:type="dxa" w:w="1728"/>
+          </w:tcPr>
+          <w:p>
+            <w:r/>
+            <w:r>
+              <w:rPr>
+                <w:b w:val="0"/>
+                <w:sz w:val="18"/>
+              </w:rPr>
+              <w:t>thumb</w:t>
+            </w:r>
+          </w:p>
+        </w:tc>
+        <w:tc>
+          <w:tcPr>
+            <w:tcW w:type="dxa" w:w="1728"/>
+          </w:tcPr>
+          <w:p>
+            <w:r/>
+            <w:r>
+              <w:rPr>
+                <w:b w:val="0"/>
+                <w:sz w:val="18"/>
+              </w:rPr>
+              <w:t>0.64</w:t>
+            </w:r>
+          </w:p>
+        </w:tc>
+        <w:tc>
+          <w:tcPr>
+            <w:tcW w:type="dxa" w:w="1728"/>
+          </w:tcPr>
+          <w:p>
+            <w:r/>
+            <w:r>
+              <w:rPr>
+                <w:b w:val="0"/>
+                <w:sz w:val="18"/>
+              </w:rPr>
+              <w:t>0.65</w:t>
+            </w:r>
+          </w:p>
+        </w:tc>
+        <w:tc>
+          <w:tcPr>
+            <w:tcW w:type="dxa" w:w="1728"/>
+          </w:tcPr>
+          <w:p>
+            <w:r/>
+            <w:r>
+              <w:rPr>
+                <w:b w:val="0"/>
+                <w:sz w:val="18"/>
+              </w:rPr>
+              <w:t>0.66</w:t>
+            </w:r>
+          </w:p>
+        </w:tc>
+        <w:tc>
+          <w:tcPr>
+            <w:tcW w:type="dxa" w:w="1728"/>
+          </w:tcPr>
+          <w:p>
+            <w:r/>
+            <w:r>
+              <w:rPr>
+                <w:b w:val="0"/>
+                <w:sz w:val="18"/>
+              </w:rPr>
+              <w:t>0.70</w:t>
+            </w:r>
+          </w:p>
+        </w:tc>
+      </w:tr>
+      <w:tr>
+        <w:tc>
+          <w:tcPr>
+            <w:tcW w:type="dxa" w:w="1728"/>
+          </w:tcPr>
+          <w:p>
+            <w:r/>
+            <w:r>
+              <w:rPr>
+                <w:b w:val="0"/>
+                <w:sz w:val="18"/>
+              </w:rPr>
+              <w:t>mini_heart</w:t>
+            </w:r>
+          </w:p>
+        </w:tc>
+        <w:tc>
+          <w:tcPr>
+            <w:tcW w:type="dxa" w:w="1728"/>
+          </w:tcPr>
+          <w:p>
+            <w:r/>
+            <w:r>
+              <w:rPr>
+                <w:b w:val="0"/>
+                <w:sz w:val="18"/>
+              </w:rPr>
+              <w:t>0.65</w:t>
+            </w:r>
+          </w:p>
+        </w:tc>
+        <w:tc>
+          <w:tcPr>
+            <w:tcW w:type="dxa" w:w="1728"/>
+          </w:tcPr>
+          <w:p>
+            <w:r/>
+            <w:r>
+              <w:rPr>
+                <w:b w:val="0"/>
+                <w:sz w:val="18"/>
+              </w:rPr>
+              <w:t>0.61</w:t>
+            </w:r>
+          </w:p>
+        </w:tc>
+        <w:tc>
+          <w:tcPr>
+            <w:tcW w:type="dxa" w:w="1728"/>
+          </w:tcPr>
+          <w:p>
+            <w:r/>
+            <w:r>
+              <w:rPr>
+                <w:b w:val="0"/>
+                <w:sz w:val="18"/>
+              </w:rPr>
+              <w:t>0.60</w:t>
+            </w:r>
+          </w:p>
+        </w:tc>
+        <w:tc>
+          <w:tcPr>
+            <w:tcW w:type="dxa" w:w="1728"/>
+          </w:tcPr>
+          <w:p>
+            <w:r/>
+            <w:r>
+              <w:rPr>
+                <w:b w:val="0"/>
+                <w:sz w:val="18"/>
+              </w:rPr>
+              <w:t>0.73</w:t>
+            </w:r>
+          </w:p>
+        </w:tc>
+      </w:tr>
+      <w:tr>
+        <w:tc>
+          <w:tcPr>
+            <w:tcW w:type="dxa" w:w="1728"/>
+          </w:tcPr>
+          <w:p>
+            <w:r/>
+            <w:r>
+              <w:rPr>
+                <w:b w:val="0"/>
+                <w:sz w:val="18"/>
+              </w:rPr>
+              <w:t>t_pose</w:t>
+            </w:r>
+          </w:p>
+        </w:tc>
+        <w:tc>
+          <w:tcPr>
+            <w:tcW w:type="dxa" w:w="1728"/>
+          </w:tcPr>
+          <w:p>
+            <w:r/>
+            <w:r>
+              <w:rPr>
+                <w:b w:val="0"/>
+                <w:sz w:val="18"/>
+              </w:rPr>
+              <w:t>0.70</w:t>
+            </w:r>
+          </w:p>
+        </w:tc>
+        <w:tc>
+          <w:tcPr>
+            <w:tcW w:type="dxa" w:w="1728"/>
+          </w:tcPr>
+          <w:p>
+            <w:r/>
+            <w:r>
+              <w:rPr>
+                <w:b w:val="0"/>
+                <w:sz w:val="18"/>
+              </w:rPr>
+              <w:t>0.68</w:t>
+            </w:r>
+          </w:p>
+        </w:tc>
+        <w:tc>
+          <w:tcPr>
+            <w:tcW w:type="dxa" w:w="1728"/>
+          </w:tcPr>
+          <w:p>
+            <w:r/>
+            <w:r>
+              <w:rPr>
+                <w:b w:val="0"/>
+                <w:sz w:val="18"/>
+              </w:rPr>
+              <w:t>0.64</w:t>
+            </w:r>
+          </w:p>
+        </w:tc>
+        <w:tc>
+          <w:tcPr>
+            <w:tcW w:type="dxa" w:w="1728"/>
+          </w:tcPr>
+          <w:p>
+            <w:r/>
+            <w:r>
+              <w:rPr>
+                <w:b w:val="0"/>
+                <w:sz w:val="18"/>
+              </w:rPr>
+              <w:t>0.77</w:t>
+            </w:r>
+          </w:p>
+        </w:tc>
+      </w:tr>
+      <w:tr>
+        <w:tc>
+          <w:tcPr>
+            <w:tcW w:type="dxa" w:w="1728"/>
+          </w:tcPr>
+          <w:p>
+            <w:r/>
+            <w:r>
+              <w:rPr>
+                <w:b w:val="0"/>
+                <w:sz w:val="18"/>
+              </w:rPr>
+              <w:t>glico_pose</w:t>
+            </w:r>
+          </w:p>
+        </w:tc>
+        <w:tc>
+          <w:tcPr>
+            <w:tcW w:type="dxa" w:w="1728"/>
+          </w:tcPr>
+          <w:p>
+            <w:r/>
+            <w:r>
+              <w:rPr>
+                <w:b w:val="0"/>
+                <w:sz w:val="18"/>
+              </w:rPr>
+              <w:t>0.69</w:t>
+            </w:r>
+          </w:p>
+        </w:tc>
+        <w:tc>
+          <w:tcPr>
+            <w:tcW w:type="dxa" w:w="1728"/>
+          </w:tcPr>
+          <w:p>
+            <w:r/>
+            <w:r>
+              <w:rPr>
+                <w:b w:val="0"/>
+                <w:sz w:val="18"/>
+              </w:rPr>
+              <w:t>0.63</w:t>
+            </w:r>
+          </w:p>
+        </w:tc>
+        <w:tc>
+          <w:tcPr>
+            <w:tcW w:type="dxa" w:w="1728"/>
+          </w:tcPr>
+          <w:p>
+            <w:r/>
+            <w:r>
+              <w:rPr>
+                <w:b w:val="0"/>
+                <w:sz w:val="18"/>
+              </w:rPr>
+              <w:t>0.65</w:t>
+            </w:r>
+          </w:p>
+        </w:tc>
+        <w:tc>
+          <w:tcPr>
+            <w:tcW w:type="dxa" w:w="1728"/>
+          </w:tcPr>
+          <w:p>
+            <w:r/>
+            <w:r>
+              <w:rPr>
+                <w:b w:val="0"/>
+                <w:sz w:val="18"/>
+              </w:rPr>
+              <w:t>0.77</w:t>
+            </w:r>
+          </w:p>
+        </w:tc>
+      </w:tr>
+    </w:tbl>
+    <w:p>
+      <w:r>
+        <w:t>It suppresses the off-hand for one-hand gestures (raise_right keeps the right-hand block far more open than the left; raise_left the mirror), leans on the joint-angle block for whole-body postures, and keeps that block the most open on average. So the feature blocks do carry the signal the schema was designed around — the plain MLP already exploits it implicitly. And this is a third independent confirmation (with Track B's body_raw_hands_derived) that the idle class is fragile to anything that reduces feature information.</w:t>
       </w:r>
     </w:p>
     <w:p>
@@ -7734,6 +10299,54 @@
     <w:p>
       <w:r>
         <w:t>Tracks B/D/E each tested one lever and each confirmed the current config: 'both' features beat the leaner alternative on stability, the AugParams defaults beat every variant tried, and val-fit confidence thresholds do not transfer to the cross-domain test split. The remaining weak classes (mini_heart 0.73, raise_*_hand 0.76, idle precision 0.62 on test) are data/feature-gap limited, not hyperparameter-limited — Phase 6 field recordings are the next real lever. Full rationale: docs/phase4_baseline.md.</w:t>
+      </w:r>
+    </w:p>
+    <w:p>
+      <w:pPr>
+        <w:pStyle w:val="Heading1"/>
+      </w:pPr>
+      <w:r>
+        <w:t>9. Handoff to Phase 5 / 6</w:t>
+      </w:r>
+    </w:p>
+    <w:p>
+      <w:pPr>
+        <w:pStyle w:val="ListBullet"/>
+      </w:pPr>
+      <w:r>
+        <w:t>Phase 5 (temporal + real-time): the classifier is per-frame. Majority vote over N frames is what smooths the frame-level idle↔gesture flicker that shows up in section 4's confusions — do not add per-class reject thresholds from the val split (Track E: they do not transfer).</w:t>
+      </w:r>
+    </w:p>
+    <w:p>
+      <w:pPr>
+        <w:pStyle w:val="ListBullet"/>
+      </w:pPr>
+      <w:r>
+        <w:t>Phase 5 idle/unknown fallback: use MLP's max-probability with the global 0.20 floor only (classifier/models/mlp.thresholds.json); the real per-class thresholds wait for field confidences.</w:t>
+      </w:r>
+    </w:p>
+    <w:p>
+      <w:pPr>
+        <w:pStyle w:val="ListBullet"/>
+      </w:pPr>
+      <w:r>
+        <w:t>Phase 6 (field recordings) is the gate for: mini_heart (0.73 — trained only on elevated aug), raise_*_hand (0.76 — cleaning filter keeps only strong raises), idle precision (0.62 — real gestures read as idle), and squat / glico_pose (aug-only, no honest test number yet).</w:t>
+      </w:r>
+    </w:p>
+    <w:p>
+      <w:pPr>
+        <w:pStyle w:val="ListBullet"/>
+      </w:pPr>
+      <w:r>
+        <w:t>Re-open with field data: the feature question — body_raw_hands_derived and the SE gate both fixed mini_heart but broke idle on our current data; more real idle footage may change that trade.</w:t>
+      </w:r>
+    </w:p>
+    <w:p>
+      <w:pPr>
+        <w:pStyle w:val="ListBullet"/>
+      </w:pPr>
+      <w:r>
+        <w:t>Backbone unchanged (CLAUDE.md): no evidence here that MediaPipe Pose/Hands is the limiter. The gap is train-domain (external stills) vs deploy-domain (robot camera).</w:t>
       </w:r>
     </w:p>
     <w:sectPr>

</xml_diff>